<commit_message>
Bedienungsanleitung nur zur Bedienung der Mappe
Technische Teile entfallen (Datenaufbereitung, Makro-Fassung, steuerliche
Rechenlogik). Neu: Abschnitt Ergebnis lesen und Tabelle der Schaltflächen;
Tabellen werden nicht über Seiten getrennt.

Co-Authored-By: Claude Opus 5.5 <noreply@anthropic.com>
Claude-Session: https://claude.ai/code/session_01HKaJyLE1UDFHJLz1dAoyYw
</commit_message>
<xml_diff>
--- a/docs/Bedienungsanleitung_Steuerberatung.docx
+++ b/docs/Bedienungsanleitung_Steuerberatung.docx
@@ -41,13 +41,13 @@
         <w:rPr>
           <w:b/>
         </w:rPr>
-        <w:t>Daten bereitstellen:</w:t>
+        <w:t>Blatt Start öffnen:</w:t>
       </w:r>
       <w:r>
         <w:rPr>
           <w:b w:val="0"/>
         </w:rPr>
-        <w:t xml:space="preserve"> Kostenstellen-Datei (DATEV-BWA, ein Blatt je Kostenstelle, in Excel gespeichert) und, falls vorhanden, das Anlagenverzeichnis (DATEV „Inventarübersicht“). Die Mappe wird daraus erzeugt; das übernimmt die technische Betreuung.</w:t>
+        <w:t xml:space="preserve"> Handlungsempfehlung, Belastbarkeit der Daten und Farblegende ansehen.</w:t>
       </w:r>
     </w:p>
     <w:p>
@@ -59,13 +59,13 @@
         <w:rPr>
           <w:b/>
         </w:rPr>
-        <w:t>Blatt Start öffnen:</w:t>
+        <w:t>Kostenstellen prüfen:</w:t>
       </w:r>
       <w:r>
         <w:rPr>
           <w:b w:val="0"/>
         </w:rPr>
-        <w:t xml:space="preserve"> Handlungsempfehlung, Belastbarkeit der Daten und Farblegende prüfen.</w:t>
+        <w:t xml:space="preserve"> Werte des Basisjahrs in den Kostenstellenblättern kontrollieren und dort korrigieren.</w:t>
       </w:r>
     </w:p>
     <w:p>
@@ -113,13 +113,13 @@
         <w:rPr>
           <w:b/>
         </w:rPr>
-        <w:t>Ergebnis lesen:</w:t>
+        <w:t>Prüfen und lesen:</w:t>
       </w:r>
       <w:r>
         <w:rPr>
           <w:b w:val="0"/>
         </w:rPr>
-        <w:t xml:space="preserve"> Start, Übersicht und Vergleich; zuvor im Blatt Prüfung sicherstellen, dass keine Fehler offen sind.</w:t>
+        <w:t xml:space="preserve"> „Plausibilität prüfen“ drücken, Fehler beheben, dann Start, Übersicht und Vergleich lesen.</w:t>
       </w:r>
     </w:p>
     <w:p>
@@ -150,6 +150,7 @@
           </w:tcPr>
           <w:p>
             <w:pPr>
+              <w:keepNext/>
               <w:spacing w:after="20"/>
             </w:pPr>
             <w:r>
@@ -173,6 +174,7 @@
           </w:tcPr>
           <w:p>
             <w:pPr>
+              <w:keepNext/>
               <w:spacing w:after="20"/>
             </w:pPr>
             <w:r>
@@ -197,6 +199,7 @@
           </w:tcPr>
           <w:p>
             <w:pPr>
+              <w:keepNext/>
               <w:spacing w:after="20"/>
             </w:pPr>
             <w:r>
@@ -219,6 +222,7 @@
           </w:tcPr>
           <w:p>
             <w:pPr>
+              <w:keepNext/>
               <w:spacing w:after="20"/>
             </w:pPr>
             <w:r>
@@ -243,6 +247,7 @@
           </w:tcPr>
           <w:p>
             <w:pPr>
+              <w:keepNext/>
               <w:spacing w:after="20"/>
             </w:pPr>
             <w:r>
@@ -265,6 +270,7 @@
           </w:tcPr>
           <w:p>
             <w:pPr>
+              <w:keepNext/>
               <w:spacing w:after="20"/>
             </w:pPr>
             <w:r>
@@ -277,7 +283,7 @@
                 <w:b w:val="0"/>
                 <w:sz w:val="19"/>
               </w:rPr>
-              <w:t>Alle Sätze und Annahmen zentral; Schaltflächen der Makros</w:t>
+              <w:t>Alle Sätze und Annahmen zentral; Schaltflächen (Abschnitt 7)</w:t>
             </w:r>
           </w:p>
         </w:tc>
@@ -289,6 +295,7 @@
           </w:tcPr>
           <w:p>
             <w:pPr>
+              <w:keepNext/>
               <w:spacing w:after="20"/>
             </w:pPr>
             <w:r>
@@ -311,6 +318,7 @@
           </w:tcPr>
           <w:p>
             <w:pPr>
+              <w:keepNext/>
               <w:spacing w:after="20"/>
             </w:pPr>
             <w:r>
@@ -335,6 +343,7 @@
           </w:tcPr>
           <w:p>
             <w:pPr>
+              <w:keepNext/>
               <w:spacing w:after="20"/>
             </w:pPr>
             <w:r>
@@ -357,6 +366,7 @@
           </w:tcPr>
           <w:p>
             <w:pPr>
+              <w:keepNext/>
               <w:spacing w:after="20"/>
             </w:pPr>
             <w:r>
@@ -381,6 +391,7 @@
           </w:tcPr>
           <w:p>
             <w:pPr>
+              <w:keepNext/>
               <w:spacing w:after="20"/>
             </w:pPr>
             <w:r>
@@ -403,6 +414,7 @@
           </w:tcPr>
           <w:p>
             <w:pPr>
+              <w:keepNext/>
               <w:spacing w:after="20"/>
             </w:pPr>
             <w:r>
@@ -427,6 +439,7 @@
           </w:tcPr>
           <w:p>
             <w:pPr>
+              <w:keepNext/>
               <w:spacing w:after="20"/>
             </w:pPr>
             <w:r>
@@ -449,6 +462,7 @@
           </w:tcPr>
           <w:p>
             <w:pPr>
+              <w:keepNext/>
               <w:spacing w:after="20"/>
             </w:pPr>
             <w:r>
@@ -473,6 +487,7 @@
           </w:tcPr>
           <w:p>
             <w:pPr>
+              <w:keepNext/>
               <w:spacing w:after="20"/>
             </w:pPr>
             <w:r>
@@ -495,6 +510,7 @@
           </w:tcPr>
           <w:p>
             <w:pPr>
+              <w:keepNext/>
               <w:spacing w:after="20"/>
             </w:pPr>
             <w:r>
@@ -507,7 +523,7 @@
                 <w:b w:val="0"/>
                 <w:sz w:val="19"/>
               </w:rPr>
-              <w:t>Wert der Immobilien und Gesamtvermögen je Jahr; Szenarien nebeneinander mit Differenzen</w:t>
+              <w:t>Ergebnis je Jahr und Szenarien nebeneinander (Abschnitt 5)</w:t>
             </w:r>
           </w:p>
         </w:tc>
@@ -519,6 +535,7 @@
           </w:tcPr>
           <w:p>
             <w:pPr>
+              <w:keepNext/>
               <w:spacing w:after="20"/>
             </w:pPr>
             <w:r>
@@ -541,6 +558,7 @@
           </w:tcPr>
           <w:p>
             <w:pPr>
+              <w:keepNext/>
               <w:spacing w:after="20"/>
             </w:pPr>
             <w:r>
@@ -565,6 +583,7 @@
           </w:tcPr>
           <w:p>
             <w:pPr>
+              <w:keepNext/>
               <w:spacing w:after="20"/>
             </w:pPr>
             <w:r>
@@ -587,6 +606,7 @@
           </w:tcPr>
           <w:p>
             <w:pPr>
+              <w:keepNext/>
               <w:spacing w:after="20"/>
             </w:pPr>
             <w:r>
@@ -599,7 +619,7 @@
                 <w:b w:val="0"/>
                 <w:sz w:val="19"/>
               </w:rPr>
-              <w:t>Ist und Plan im DATEV-BWA-Format je Kostenstelle und als Summe; Verkauf und Kauf als eigenes Blatt</w:t>
+              <w:t>Ist und Plan im BWA-Format je Kostenstelle und als Summe; Verkauf und Kauf als eigenes Blatt</w:t>
             </w:r>
           </w:p>
         </w:tc>
@@ -639,6 +659,7 @@
           </w:tcPr>
           <w:p>
             <w:pPr>
+              <w:keepNext/>
               <w:spacing w:after="20"/>
             </w:pPr>
             <w:r>
@@ -662,6 +683,7 @@
           </w:tcPr>
           <w:p>
             <w:pPr>
+              <w:keepNext/>
               <w:spacing w:after="20"/>
             </w:pPr>
             <w:r>
@@ -685,6 +707,7 @@
           </w:tcPr>
           <w:p>
             <w:pPr>
+              <w:keepNext/>
               <w:spacing w:after="20"/>
             </w:pPr>
             <w:r>
@@ -710,6 +733,7 @@
           </w:tcPr>
           <w:p>
             <w:pPr>
+              <w:keepNext/>
               <w:spacing w:after="20"/>
             </w:pPr>
             <w:r>
@@ -732,6 +756,7 @@
           </w:tcPr>
           <w:p>
             <w:pPr>
+              <w:keepNext/>
               <w:spacing w:after="20"/>
             </w:pPr>
             <w:r>
@@ -754,6 +779,7 @@
           </w:tcPr>
           <w:p>
             <w:pPr>
+              <w:keepNext/>
               <w:spacing w:after="20"/>
             </w:pPr>
             <w:r>
@@ -779,6 +805,7 @@
           </w:tcPr>
           <w:p>
             <w:pPr>
+              <w:keepNext/>
               <w:spacing w:after="20"/>
             </w:pPr>
             <w:r>
@@ -801,6 +828,7 @@
           </w:tcPr>
           <w:p>
             <w:pPr>
+              <w:keepNext/>
               <w:spacing w:after="20"/>
             </w:pPr>
             <w:r>
@@ -823,6 +851,7 @@
           </w:tcPr>
           <w:p>
             <w:pPr>
+              <w:keepNext/>
               <w:spacing w:after="20"/>
             </w:pPr>
             <w:r>
@@ -848,6 +877,7 @@
           </w:tcPr>
           <w:p>
             <w:pPr>
+              <w:keepNext/>
               <w:spacing w:after="20"/>
             </w:pPr>
             <w:r>
@@ -870,6 +900,7 @@
           </w:tcPr>
           <w:p>
             <w:pPr>
+              <w:keepNext/>
               <w:spacing w:after="20"/>
             </w:pPr>
             <w:r>
@@ -892,6 +923,7 @@
           </w:tcPr>
           <w:p>
             <w:pPr>
+              <w:keepNext/>
               <w:spacing w:after="20"/>
             </w:pPr>
             <w:r>
@@ -917,6 +949,7 @@
           </w:tcPr>
           <w:p>
             <w:pPr>
+              <w:keepNext/>
               <w:spacing w:after="20"/>
             </w:pPr>
             <w:r>
@@ -939,6 +972,7 @@
           </w:tcPr>
           <w:p>
             <w:pPr>
+              <w:keepNext/>
               <w:spacing w:after="20"/>
             </w:pPr>
             <w:r>
@@ -961,6 +995,7 @@
           </w:tcPr>
           <w:p>
             <w:pPr>
+              <w:keepNext/>
               <w:spacing w:after="20"/>
             </w:pPr>
             <w:r>
@@ -986,6 +1021,7 @@
           </w:tcPr>
           <w:p>
             <w:pPr>
+              <w:keepNext/>
               <w:spacing w:after="20"/>
             </w:pPr>
             <w:r>
@@ -1008,6 +1044,7 @@
           </w:tcPr>
           <w:p>
             <w:pPr>
+              <w:keepNext/>
               <w:spacing w:after="20"/>
             </w:pPr>
             <w:r>
@@ -1030,6 +1067,7 @@
           </w:tcPr>
           <w:p>
             <w:pPr>
+              <w:keepNext/>
               <w:spacing w:after="20"/>
             </w:pPr>
             <w:r>
@@ -1055,6 +1093,7 @@
           </w:tcPr>
           <w:p>
             <w:pPr>
+              <w:keepNext/>
               <w:spacing w:after="20"/>
             </w:pPr>
             <w:r>
@@ -1077,6 +1116,7 @@
           </w:tcPr>
           <w:p>
             <w:pPr>
+              <w:keepNext/>
               <w:spacing w:after="20"/>
             </w:pPr>
             <w:r>
@@ -1099,6 +1139,7 @@
           </w:tcPr>
           <w:p>
             <w:pPr>
+              <w:keepNext/>
               <w:spacing w:after="20"/>
             </w:pPr>
             <w:r>
@@ -1223,7 +1264,7 @@
         <w:rPr>
           <w:b w:val="0"/>
         </w:rPr>
-        <w:t>Alle Kostenstellen hinter „KSt 9999“ gelten als geplante Käufe. Sie erhalten ein eigenes Blatt (Basisjahr und Planjahre gelb), zählen aber nicht zu „Alle Objekte“. Trägt man die Kostenstelle im Blatt Neuobjekte unter „Kostenstelle Neukauf“ ein, übernimmt die Prognose ab dem Jahr nach dem Kauf Miete, Einnahmen, Erhaltung und Ausgaben aus diesem Blatt; Jahre ohne Wert werden mit der Steigerung fortgeschrieben. Die AfA rechnet weiter das Modell aus Kaufpreis, Anteil G+B, AfA-Satz und § 6b-Übertragung.</w:t>
+        <w:t>Alle Kostenstellen hinter „KSt 9999“ gelten als geplante Käufe. Sie erhalten ein eigenes Blatt (Basisjahr und Planjahre gelb), zählen aber nicht zu „Alle Objekte“. Trägt man die Kostenstelle im Blatt Neuobjekte unter „Kostenstelle Neukauf“ ein, übernimmt die Prognose ab dem Jahr nach dem Kauf Miete, Einnahmen, Erhaltung und Ausgaben aus diesem Blatt; Jahre ohne Wert werden mit der Steigerung fortgeschrieben. Kaufpreis, Anteil G+B und AfA-Satz bleiben Eingaben im Blatt Neuobjekte.</w:t>
       </w:r>
     </w:p>
     <w:p>
@@ -1231,7 +1272,7 @@
         <w:pStyle w:val="Heading1"/>
       </w:pPr>
       <w:r>
-        <w:t>5. Steuerliche Logik in Kürze</w:t>
+        <w:t>5. Ergebnis lesen</w:t>
       </w:r>
     </w:p>
     <w:p>
@@ -1243,13 +1284,13 @@
         <w:rPr>
           <w:b/>
         </w:rPr>
-        <w:t>Verkauf</w:t>
+        <w:t>Start:</w:t>
       </w:r>
       <w:r>
         <w:rPr>
           <w:b w:val="0"/>
         </w:rPr>
-        <w:t xml:space="preserve"> zum Jahresende; Miete und AfA laufen im Verkaufsjahr noch. Der Erlös wird nach Kaufvertrag, sonst nach Verkehrswertanteil auf Gebäude und G+B aufgeteilt.</w:t>
+        <w:t xml:space="preserve"> empfohlene Option mit dem höchsten Endvermögen nach latenter Steuer, Vorsprung gegenüber Halten und tiefster Liquiditätsstand.</w:t>
       </w:r>
     </w:p>
     <w:p>
@@ -1261,13 +1302,13 @@
         <w:rPr>
           <w:b/>
         </w:rPr>
-        <w:t>§ 6b-Rücklage</w:t>
+        <w:t>Übersicht:</w:t>
       </w:r>
       <w:r>
         <w:rPr>
           <w:b w:val="0"/>
         </w:rPr>
-        <w:t xml:space="preserve"> aus den positiven Teilgewinnen, getrennt nach Gebäude und G+B. Frist vier Jahre, mit begonnenem Neubau sechs. Nicht übertragene Rücklage wird im Fristjahr aufgelöst, mit 6 % Zuschlag je Jahr.</w:t>
+        <w:t xml:space="preserve"> Wert der Immobilien und Gesamtvermögen je Jahr, als Tabelle und Diagramm, mit und ohne die geplanten Verkäufe.</w:t>
       </w:r>
     </w:p>
     <w:p>
@@ -1279,13 +1320,13 @@
         <w:rPr>
           <w:b/>
         </w:rPr>
-        <w:t>Übertragung</w:t>
+        <w:t>Vergleich:</w:t>
       </w:r>
       <w:r>
         <w:rPr>
           <w:b w:val="0"/>
         </w:rPr>
-        <w:t xml:space="preserve"> in fester Reihenfolge: Gebäudegewinn auf Gebäude, G+B-Gewinn auf G+B, Rest auf das Gebäude. Die AfA des Neuobjekts läuft von der geminderten Basis.</w:t>
+        <w:t xml:space="preserve"> Kennzahlen der Szenarien am Ende des Prognosezeitraums nebeneinander.</w:t>
       </w:r>
     </w:p>
     <w:p>
@@ -1297,39 +1338,13 @@
         <w:rPr>
           <w:b/>
         </w:rPr>
-        <w:t>Steuer</w:t>
+        <w:t>Varianten:</w:t>
       </w:r>
       <w:r>
         <w:rPr>
           <w:b w:val="0"/>
         </w:rPr>
-        <w:t xml:space="preserve"> = (laufendes Ergebnis + steuerwirksamer Rücklagenbetrag) × Grenzsteuersatz; Verluste werden vorgetragen. Freie Liquidität wird mit der Alternativrendite verzinst.</w:t>
-      </w:r>
-    </w:p>
-    <w:p>
-      <w:pPr>
-        <w:pStyle w:val="ListBullet"/>
-        <w:spacing w:after="40"/>
-      </w:pPr>
-      <w:r>
-        <w:rPr>
-          <w:b/>
-        </w:rPr>
-        <w:t>Erhaltung</w:t>
-      </w:r>
-      <w:r>
-        <w:rPr>
-          <w:b w:val="0"/>
-        </w:rPr>
-        <w:t xml:space="preserve"> steigt ab 30 Jahren Gebäudealter zusätzlich; ab 50 Jahren fällt eine Großmaßnahme an (Standard 15 % des Gebäudewerts). Neuobjekte tragen anfangs die Hälfte.</w:t>
-      </w:r>
-    </w:p>
-    <w:p>
-      <w:pPr>
-        <w:pStyle w:val="Heading2"/>
-      </w:pPr>
-      <w:r>
-        <w:t>Szenarien</w:t>
+        <w:t xml:space="preserve"> mit „Variante festhalten“ gesicherte Stände, etwa verschiedene Verkaufsjahre.</w:t>
       </w:r>
     </w:p>
     <w:tbl>
@@ -1352,6 +1367,7 @@
           </w:tcPr>
           <w:p>
             <w:pPr>
+              <w:keepNext/>
               <w:spacing w:after="20"/>
             </w:pPr>
             <w:r>
@@ -1375,6 +1391,7 @@
           </w:tcPr>
           <w:p>
             <w:pPr>
+              <w:keepNext/>
               <w:spacing w:after="20"/>
             </w:pPr>
             <w:r>
@@ -1399,6 +1416,7 @@
           </w:tcPr>
           <w:p>
             <w:pPr>
+              <w:keepNext/>
               <w:spacing w:after="20"/>
             </w:pPr>
             <w:r>
@@ -1421,6 +1439,7 @@
           </w:tcPr>
           <w:p>
             <w:pPr>
+              <w:keepNext/>
               <w:spacing w:after="20"/>
             </w:pPr>
             <w:r>
@@ -1445,6 +1464,7 @@
           </w:tcPr>
           <w:p>
             <w:pPr>
+              <w:keepNext/>
               <w:spacing w:after="20"/>
             </w:pPr>
             <w:r>
@@ -1467,6 +1487,7 @@
           </w:tcPr>
           <w:p>
             <w:pPr>
+              <w:keepNext/>
               <w:spacing w:after="20"/>
             </w:pPr>
             <w:r>
@@ -1479,7 +1500,7 @@
                 <w:b w:val="0"/>
                 <w:sz w:val="19"/>
               </w:rPr>
-              <w:t>Gewinn sofort versteuert, kein Neukauf aus der Rücklage, Geld in der Alternativanlage</w:t>
+              <w:t>Gewinn sofort versteuert, kein Neukauf aus der Rücklage, Geld angelegt</w:t>
             </w:r>
           </w:p>
         </w:tc>
@@ -1491,6 +1512,7 @@
           </w:tcPr>
           <w:p>
             <w:pPr>
+              <w:keepNext/>
               <w:spacing w:after="20"/>
             </w:pPr>
             <w:r>
@@ -1513,6 +1535,7 @@
           </w:tcPr>
           <w:p>
             <w:pPr>
+              <w:keepNext/>
               <w:spacing w:after="20"/>
             </w:pPr>
             <w:r>
@@ -1525,7 +1548,7 @@
                 <w:b w:val="0"/>
                 <w:sz w:val="19"/>
               </w:rPr>
-              <w:t>sofort versteuert, Neuobjekte trotzdem gekauft, volle AfA-Basis</w:t>
+              <w:t>sofort versteuert, Neuobjekte trotzdem gekauft</w:t>
             </w:r>
           </w:p>
         </w:tc>
@@ -1537,6 +1560,7 @@
           </w:tcPr>
           <w:p>
             <w:pPr>
+              <w:keepNext/>
               <w:spacing w:after="20"/>
             </w:pPr>
             <w:r>
@@ -1559,6 +1583,7 @@
           </w:tcPr>
           <w:p>
             <w:pPr>
+              <w:keepNext/>
               <w:spacing w:after="20"/>
             </w:pPr>
             <w:r>
@@ -1583,19 +1608,11 @@
       </w:pPr>
     </w:p>
     <w:p>
-      <w:r>
-        <w:rPr>
-          <w:b w:val="0"/>
-        </w:rPr>
-        <w:t>A − C zeigt die reine Wirkung von § 6b: der Zins auf die gestundete Steuer.</w:t>
-      </w:r>
-    </w:p>
-    <w:p>
       <w:pPr>
         <w:pStyle w:val="Heading1"/>
       </w:pPr>
       <w:r>
-        <w:t>6. Prüfung und Schaltflächen</w:t>
+        <w:t>6. Prüfung</w:t>
       </w:r>
     </w:p>
     <w:p>
@@ -1613,7 +1630,7 @@
         <w:rPr>
           <w:b w:val="0"/>
         </w:rPr>
-        <w:t xml:space="preserve"> Status ungleich OK (Objekte, Verkäufe, Neuobjekte), Fristverstoß, Steuerwelt nicht GmbH. Vor jeder Auswertung beheben.</w:t>
+        <w:t xml:space="preserve"> Status ungleich OK in Objekten, Verkäufen oder Neuobjekten, Fristverstoß. Vor jeder Auswertung beheben.</w:t>
       </w:r>
     </w:p>
     <w:p>
@@ -1653,19 +1670,423 @@
       </w:r>
     </w:p>
     <w:p>
+      <w:pPr>
+        <w:pStyle w:val="Heading1"/>
+      </w:pPr>
       <w:r>
-        <w:rPr>
-          <w:b w:val="0"/>
-        </w:rPr>
-        <w:t>In der Makro-Fassung (.xlsm) stehen auf dem Parameterblatt: Plausibilität prüfen, Neu berechnen, Variante festhalten (Kennzahlen als feste Werte im Blatt Varianten, etwa für verschiedene Verkaufsjahre), Objekt anlegen, duplizieren, entfernen, Annahmen wiederherstellen, Objekte -&gt; Kostenstellen, leere Prognoseblöcke aus-/einblenden. Makros rechnen nichts; alle Ergebnisse stehen in den Zellformeln.</w:t>
+        <w:t>7. Schaltflächen (Blatt Parameter)</w:t>
       </w:r>
+    </w:p>
+    <w:tbl>
+      <w:tblPr>
+        <w:tblStyle w:val="TableGrid"/>
+        <w:tblW w:type="auto" w:w="0"/>
+        <w:jc w:val="center"/>
+        <w:tblLayout w:type="fixed"/>
+        <w:tblLook w:firstColumn="1" w:firstRow="1" w:lastColumn="0" w:lastRow="0" w:noHBand="0" w:noVBand="1" w:val="04A0"/>
+      </w:tblPr>
+      <w:tblGrid>
+        <w:gridCol w:w="3515"/>
+        <w:gridCol w:w="5896"/>
+      </w:tblGrid>
+      <w:tr>
+        <w:tc>
+          <w:tcPr>
+            <w:tcW w:type="dxa" w:w="3515"/>
+            <w:shd w:val="clear" w:fill="D9E2F3"/>
+          </w:tcPr>
+          <w:p>
+            <w:pPr>
+              <w:keepNext/>
+              <w:spacing w:after="20"/>
+            </w:pPr>
+            <w:r>
+              <w:rPr>
+                <w:sz w:val="19"/>
+              </w:rPr>
+            </w:r>
+            <w:r>
+              <w:rPr>
+                <w:b/>
+                <w:sz w:val="19"/>
+              </w:rPr>
+              <w:t>Schaltfläche</w:t>
+            </w:r>
+          </w:p>
+        </w:tc>
+        <w:tc>
+          <w:tcPr>
+            <w:tcW w:type="dxa" w:w="5896"/>
+            <w:shd w:val="clear" w:fill="D9E2F3"/>
+          </w:tcPr>
+          <w:p>
+            <w:pPr>
+              <w:keepNext/>
+              <w:spacing w:after="20"/>
+            </w:pPr>
+            <w:r>
+              <w:rPr>
+                <w:sz w:val="19"/>
+              </w:rPr>
+            </w:r>
+            <w:r>
+              <w:rPr>
+                <w:b/>
+                <w:sz w:val="19"/>
+              </w:rPr>
+              <w:t>Wirkung</w:t>
+            </w:r>
+          </w:p>
+        </w:tc>
+      </w:tr>
+      <w:tr>
+        <w:tc>
+          <w:tcPr>
+            <w:tcW w:type="dxa" w:w="3515"/>
+          </w:tcPr>
+          <w:p>
+            <w:pPr>
+              <w:keepNext/>
+              <w:spacing w:after="20"/>
+            </w:pPr>
+            <w:r>
+              <w:rPr>
+                <w:sz w:val="19"/>
+              </w:rPr>
+            </w:r>
+            <w:r>
+              <w:rPr>
+                <w:b w:val="0"/>
+                <w:sz w:val="19"/>
+              </w:rPr>
+              <w:t>Plausibilität prüfen</w:t>
+            </w:r>
+          </w:p>
+        </w:tc>
+        <w:tc>
+          <w:tcPr>
+            <w:tcW w:type="dxa" w:w="5896"/>
+          </w:tcPr>
+          <w:p>
+            <w:pPr>
+              <w:keepNext/>
+              <w:spacing w:after="20"/>
+            </w:pPr>
+            <w:r>
+              <w:rPr>
+                <w:sz w:val="19"/>
+              </w:rPr>
+            </w:r>
+            <w:r>
+              <w:rPr>
+                <w:b w:val="0"/>
+                <w:sz w:val="19"/>
+              </w:rPr>
+              <w:t>zeigt alle Fehler, Warnungen und Hinweise</w:t>
+            </w:r>
+          </w:p>
+        </w:tc>
+      </w:tr>
+      <w:tr>
+        <w:tc>
+          <w:tcPr>
+            <w:tcW w:type="dxa" w:w="3515"/>
+          </w:tcPr>
+          <w:p>
+            <w:pPr>
+              <w:keepNext/>
+              <w:spacing w:after="20"/>
+            </w:pPr>
+            <w:r>
+              <w:rPr>
+                <w:sz w:val="19"/>
+              </w:rPr>
+            </w:r>
+            <w:r>
+              <w:rPr>
+                <w:b w:val="0"/>
+                <w:sz w:val="19"/>
+              </w:rPr>
+              <w:t>Neu berechnen</w:t>
+            </w:r>
+          </w:p>
+        </w:tc>
+        <w:tc>
+          <w:tcPr>
+            <w:tcW w:type="dxa" w:w="5896"/>
+          </w:tcPr>
+          <w:p>
+            <w:pPr>
+              <w:keepNext/>
+              <w:spacing w:after="20"/>
+            </w:pPr>
+            <w:r>
+              <w:rPr>
+                <w:sz w:val="19"/>
+              </w:rPr>
+            </w:r>
+            <w:r>
+              <w:rPr>
+                <w:b w:val="0"/>
+                <w:sz w:val="19"/>
+              </w:rPr>
+              <w:t>rechnet die Mappe vollständig neu</w:t>
+            </w:r>
+          </w:p>
+        </w:tc>
+      </w:tr>
+      <w:tr>
+        <w:tc>
+          <w:tcPr>
+            <w:tcW w:type="dxa" w:w="3515"/>
+          </w:tcPr>
+          <w:p>
+            <w:pPr>
+              <w:keepNext/>
+              <w:spacing w:after="20"/>
+            </w:pPr>
+            <w:r>
+              <w:rPr>
+                <w:sz w:val="19"/>
+              </w:rPr>
+            </w:r>
+            <w:r>
+              <w:rPr>
+                <w:b w:val="0"/>
+                <w:sz w:val="19"/>
+              </w:rPr>
+              <w:t>Variante festhalten</w:t>
+            </w:r>
+          </w:p>
+        </w:tc>
+        <w:tc>
+          <w:tcPr>
+            <w:tcW w:type="dxa" w:w="5896"/>
+          </w:tcPr>
+          <w:p>
+            <w:pPr>
+              <w:keepNext/>
+              <w:spacing w:after="20"/>
+            </w:pPr>
+            <w:r>
+              <w:rPr>
+                <w:sz w:val="19"/>
+              </w:rPr>
+            </w:r>
+            <w:r>
+              <w:rPr>
+                <w:b w:val="0"/>
+                <w:sz w:val="19"/>
+              </w:rPr>
+              <w:t>speichert die Kennzahlen des Vergleichs im Blatt Varianten</w:t>
+            </w:r>
+          </w:p>
+        </w:tc>
+      </w:tr>
+      <w:tr>
+        <w:tc>
+          <w:tcPr>
+            <w:tcW w:type="dxa" w:w="3515"/>
+          </w:tcPr>
+          <w:p>
+            <w:pPr>
+              <w:keepNext/>
+              <w:spacing w:after="20"/>
+            </w:pPr>
+            <w:r>
+              <w:rPr>
+                <w:sz w:val="19"/>
+              </w:rPr>
+            </w:r>
+            <w:r>
+              <w:rPr>
+                <w:b w:val="0"/>
+                <w:sz w:val="19"/>
+              </w:rPr>
+              <w:t>Objekt anlegen / duplizieren / entfernen</w:t>
+            </w:r>
+          </w:p>
+        </w:tc>
+        <w:tc>
+          <w:tcPr>
+            <w:tcW w:type="dxa" w:w="5896"/>
+          </w:tcPr>
+          <w:p>
+            <w:pPr>
+              <w:keepNext/>
+              <w:spacing w:after="20"/>
+            </w:pPr>
+            <w:r>
+              <w:rPr>
+                <w:sz w:val="19"/>
+              </w:rPr>
+            </w:r>
+            <w:r>
+              <w:rPr>
+                <w:b w:val="0"/>
+                <w:sz w:val="19"/>
+              </w:rPr>
+              <w:t>pflegt die Zeilen im Blatt Objekte</w:t>
+            </w:r>
+          </w:p>
+        </w:tc>
+      </w:tr>
+      <w:tr>
+        <w:tc>
+          <w:tcPr>
+            <w:tcW w:type="dxa" w:w="3515"/>
+          </w:tcPr>
+          <w:p>
+            <w:pPr>
+              <w:keepNext/>
+              <w:spacing w:after="20"/>
+            </w:pPr>
+            <w:r>
+              <w:rPr>
+                <w:sz w:val="19"/>
+              </w:rPr>
+            </w:r>
+            <w:r>
+              <w:rPr>
+                <w:b w:val="0"/>
+                <w:sz w:val="19"/>
+              </w:rPr>
+              <w:t>Annahmen wiederherstellen</w:t>
+            </w:r>
+          </w:p>
+        </w:tc>
+        <w:tc>
+          <w:tcPr>
+            <w:tcW w:type="dxa" w:w="5896"/>
+          </w:tcPr>
+          <w:p>
+            <w:pPr>
+              <w:keepNext/>
+              <w:spacing w:after="20"/>
+            </w:pPr>
+            <w:r>
+              <w:rPr>
+                <w:sz w:val="19"/>
+              </w:rPr>
+            </w:r>
+            <w:r>
+              <w:rPr>
+                <w:b w:val="0"/>
+                <w:sz w:val="19"/>
+              </w:rPr>
+              <w:t>setzt geleerte Felder wieder auf die Annahme</w:t>
+            </w:r>
+          </w:p>
+        </w:tc>
+      </w:tr>
+      <w:tr>
+        <w:tc>
+          <w:tcPr>
+            <w:tcW w:type="dxa" w:w="3515"/>
+          </w:tcPr>
+          <w:p>
+            <w:pPr>
+              <w:keepNext/>
+              <w:spacing w:after="20"/>
+            </w:pPr>
+            <w:r>
+              <w:rPr>
+                <w:sz w:val="19"/>
+              </w:rPr>
+            </w:r>
+            <w:r>
+              <w:rPr>
+                <w:b w:val="0"/>
+                <w:sz w:val="19"/>
+              </w:rPr>
+              <w:t>Objekte -&gt; Kostenstellen</w:t>
+            </w:r>
+          </w:p>
+        </w:tc>
+        <w:tc>
+          <w:tcPr>
+            <w:tcW w:type="dxa" w:w="5896"/>
+          </w:tcPr>
+          <w:p>
+            <w:pPr>
+              <w:keepNext/>
+              <w:spacing w:after="20"/>
+            </w:pPr>
+            <w:r>
+              <w:rPr>
+                <w:sz w:val="19"/>
+              </w:rPr>
+            </w:r>
+            <w:r>
+              <w:rPr>
+                <w:b w:val="0"/>
+                <w:sz w:val="19"/>
+              </w:rPr>
+              <w:t>überträgt überschriebene Werte ins Kostenstellenblatt</w:t>
+            </w:r>
+          </w:p>
+        </w:tc>
+      </w:tr>
+      <w:tr>
+        <w:tc>
+          <w:tcPr>
+            <w:tcW w:type="dxa" w:w="3515"/>
+          </w:tcPr>
+          <w:p>
+            <w:pPr>
+              <w:keepNext/>
+              <w:spacing w:after="20"/>
+            </w:pPr>
+            <w:r>
+              <w:rPr>
+                <w:sz w:val="19"/>
+              </w:rPr>
+            </w:r>
+            <w:r>
+              <w:rPr>
+                <w:b w:val="0"/>
+                <w:sz w:val="19"/>
+              </w:rPr>
+              <w:t>Leere Prognoseblöcke aus-/einblenden</w:t>
+            </w:r>
+          </w:p>
+        </w:tc>
+        <w:tc>
+          <w:tcPr>
+            <w:tcW w:type="dxa" w:w="5896"/>
+          </w:tcPr>
+          <w:p>
+            <w:pPr>
+              <w:keepNext/>
+              <w:spacing w:after="20"/>
+            </w:pPr>
+            <w:r>
+              <w:rPr>
+                <w:sz w:val="19"/>
+              </w:rPr>
+            </w:r>
+            <w:r>
+              <w:rPr>
+                <w:b w:val="0"/>
+                <w:sz w:val="19"/>
+              </w:rPr>
+              <w:t>blendet ungenutzte Zeilen der Prognose aus</w:t>
+            </w:r>
+          </w:p>
+        </w:tc>
+      </w:tr>
+    </w:tbl>
+    <w:p>
+      <w:pPr>
+        <w:spacing w:after="0"/>
+      </w:pPr>
     </w:p>
     <w:p>
       <w:pPr>
         <w:pStyle w:val="Heading1"/>
       </w:pPr>
       <w:r>
-        <w:t>7. Praxistipps</w:t>
+        <w:t>8. Praxistipps</w:t>
       </w:r>
     </w:p>
     <w:p>
@@ -1689,19 +2110,7 @@
         <w:rPr>
           <w:b w:val="0"/>
         </w:rPr>
-        <w:t xml:space="preserve">Der </w:t>
-      </w:r>
-      <w:r>
-        <w:rPr>
-          <w:b/>
-        </w:rPr>
-        <w:t>Schnellcheck</w:t>
-      </w:r>
-      <w:r>
-        <w:rPr>
-          <w:b w:val="0"/>
-        </w:rPr>
-        <w:t xml:space="preserve"> (schlanke Mappe) genügt für eine erste Einschätzung: ObjektID und Miete je Objekt plus ein geplanter Verkauf.</w:t>
+        <w:t>Graue Formelzellen nicht überschreiben; Änderungen immer in gelben oder blauen Zellen.</w:t>
       </w:r>
     </w:p>
     <w:p>

</xml_diff>

<commit_message>
Finanzierung der Neuobjekte, bis zu drei Quell-Rücklagen
- Blatt Neuobjekte: Quelle 1–3 (Auswahl aus den Rücklagen), Übertragung über alle
  Quellen (erst alle ü1, dann ü2, dann ü3), Werte je Quelle eingeklappt
- Finanzierungsbedarf = AK − Nettoerlös der Quell-Verkäufe; Rest aus Eigenmitteln
  oder per Kredit (Annuität, linear, endfällig, optionale Laufzeit)
- neues Blatt Darlehen: Zins, Tilgung, Restschuld je Kredit und Jahr
- Zinsen in Prognose, Liquidität, Auswertung und BWA 1310; Tilgung in der
  Liquidität, Restschuld mindert das Gesamtvermögen; Szenario B ohne, C mit Kredit
- Kostenstelle Neukauf als Auswahlliste; deren Blatt ist zugleich das Blatt des
  Neuobjekts (AfA und Zinsen aus dem Modell)
- Prüfung „restschuld“, drei neue Prüffälle, README, Projektplan, Anleitung

Co-Authored-By: Claude Opus 5.5 <noreply@anthropic.com>
Claude-Session: https://claude.ai/code/session_01HKaJyLE1UDFHJLz1dAoyYw
</commit_message>
<xml_diff>
--- a/docs/Bedienungsanleitung_Steuerberatung.docx
+++ b/docs/Bedienungsanleitung_Steuerberatung.docx
@@ -427,7 +427,55 @@
                 <w:b w:val="0"/>
                 <w:sz w:val="19"/>
               </w:rPr>
-              <w:t>Kaufjahr, Kaufpreis, Anteil G+B, AfA-Satz und -Methode, Quelle-Rücklage, optional „Kostenstelle Neukauf“</w:t>
+              <w:t>Kaufjahr, Kaufpreis, Anteil G+B, AfA-Satz und -Methode, bis zu drei Quell-Rücklagen, „Kostenstelle Neukauf“, Finanzierung (Abschnitt 4)</w:t>
+            </w:r>
+          </w:p>
+        </w:tc>
+      </w:tr>
+      <w:tr>
+        <w:tc>
+          <w:tcPr>
+            <w:tcW w:type="dxa" w:w="2381"/>
+          </w:tcPr>
+          <w:p>
+            <w:pPr>
+              <w:keepNext/>
+              <w:spacing w:after="20"/>
+            </w:pPr>
+            <w:r>
+              <w:rPr>
+                <w:sz w:val="19"/>
+              </w:rPr>
+            </w:r>
+            <w:r>
+              <w:rPr>
+                <w:b/>
+                <w:sz w:val="19"/>
+              </w:rPr>
+              <w:t>Darlehen</w:t>
+            </w:r>
+          </w:p>
+        </w:tc>
+        <w:tc>
+          <w:tcPr>
+            <w:tcW w:type="dxa" w:w="7030"/>
+          </w:tcPr>
+          <w:p>
+            <w:pPr>
+              <w:keepNext/>
+              <w:spacing w:after="20"/>
+            </w:pPr>
+            <w:r>
+              <w:rPr>
+                <w:sz w:val="19"/>
+              </w:rPr>
+            </w:r>
+            <w:r>
+              <w:rPr>
+                <w:b w:val="0"/>
+                <w:sz w:val="19"/>
+              </w:rPr>
+              <w:t>Tilgungsplan je Kredit: Zins, Tilgung und Restschuld je Jahr</w:t>
             </w:r>
           </w:p>
         </w:tc>
@@ -1264,7 +1312,99 @@
         <w:rPr>
           <w:b w:val="0"/>
         </w:rPr>
-        <w:t>Alle Kostenstellen hinter „KSt 9999“ gelten als geplante Käufe. Sie erhalten ein eigenes Blatt (Basisjahr und Planjahre gelb), zählen aber nicht zu „Alle Objekte“. Trägt man die Kostenstelle im Blatt Neuobjekte unter „Kostenstelle Neukauf“ ein, übernimmt die Prognose ab dem Jahr nach dem Kauf Miete, Einnahmen, Erhaltung und Ausgaben aus diesem Blatt; Jahre ohne Wert werden mit der Steigerung fortgeschrieben. Kaufpreis, Anteil G+B und AfA-Satz bleiben Eingaben im Blatt Neuobjekte.</w:t>
+        <w:t>Alle Kostenstellen hinter „KSt 9999“ gelten als geplante Käufe. Sie erhalten ein eigenes Blatt (Basisjahr und Planjahre gelb). Wählt man die Kostenstelle im Blatt Neuobjekte unter „Kostenstelle Neukauf“ aus, übernimmt die Prognose ab dem Jahr nach dem Kauf Miete, Einnahmen, Erhaltung und Ausgaben aus diesem Blatt; Jahre ohne Wert werden mit der Steigerung fortgeschrieben. Das Blatt ist dann zugleich das Blatt des Neuobjekts: AfA und Kreditzinsen kommen grau aus dem Modell, das Neuobjekt zählt in „Alle Objekte“. Kaufpreis, Anteil G+B und AfA-Satz bleiben Eingaben im Blatt Neuobjekte.</w:t>
+      </w:r>
+    </w:p>
+    <w:p>
+      <w:pPr>
+        <w:pStyle w:val="Heading2"/>
+      </w:pPr>
+      <w:r>
+        <w:t>Rücklagen und Finanzierung eines Kaufs</w:t>
+      </w:r>
+    </w:p>
+    <w:p>
+      <w:pPr>
+        <w:pStyle w:val="ListBullet"/>
+        <w:spacing w:after="40"/>
+      </w:pPr>
+      <w:r>
+        <w:rPr>
+          <w:b/>
+        </w:rPr>
+        <w:t>Quell-Rücklagen:</w:t>
+      </w:r>
+      <w:r>
+        <w:rPr>
+          <w:b w:val="0"/>
+        </w:rPr>
+        <w:t xml:space="preserve"> bis zu drei Rücklagen je Neuobjekt aus der Auswahlliste. Übertragen werden erst alle Gebäudegewinne auf das Gebäude, dann die G+B-Gewinne auf G+B, der Rest auf das Gebäude. Ob die Übertragung im Einzelfall gewollt ist, entscheidet der Berater.</w:t>
+      </w:r>
+    </w:p>
+    <w:p>
+      <w:pPr>
+        <w:pStyle w:val="ListBullet"/>
+        <w:spacing w:after="40"/>
+      </w:pPr>
+      <w:r>
+        <w:rPr>
+          <w:b/>
+        </w:rPr>
+        <w:t>Finanzierungsbedarf</w:t>
+      </w:r>
+      <w:r>
+        <w:rPr>
+          <w:b w:val="0"/>
+        </w:rPr>
+        <w:t xml:space="preserve"> = Kaufpreis + Nebenkosten − Nettoerlös der Quell-Verkäufe.</w:t>
+      </w:r>
+    </w:p>
+    <w:p>
+      <w:pPr>
+        <w:pStyle w:val="ListBullet"/>
+        <w:spacing w:after="40"/>
+      </w:pPr>
+      <w:r>
+        <w:rPr>
+          <w:b/>
+        </w:rPr>
+        <w:t>Finanzierung Rest:</w:t>
+      </w:r>
+      <w:r>
+        <w:rPr>
+          <w:b w:val="0"/>
+        </w:rPr>
+        <w:t xml:space="preserve"> leer bzw. „Eigenmittel“ zahlt den Bedarf aus der Liquidität; „Kredit“ finanziert ihn. Kreditbetrag leer = ganzer Bedarf, sonst der eingetragene Betrag, der Rest kommt aus Eigenmitteln.</w:t>
+      </w:r>
+    </w:p>
+    <w:p>
+      <w:pPr>
+        <w:pStyle w:val="ListBullet"/>
+        <w:spacing w:after="40"/>
+      </w:pPr>
+      <w:r>
+        <w:rPr>
+          <w:b/>
+        </w:rPr>
+        <w:t>Kreditangaben:</w:t>
+      </w:r>
+      <w:r>
+        <w:rPr>
+          <w:b w:val="0"/>
+        </w:rPr>
+        <w:t xml:space="preserve"> Zinssatz, Tilgungsart (Annuität mit anfänglicher Tilgung, linear oder endfällig), Tilgung p. a., optional die Laufzeit, nach der die Restschuld getilgt wird.</w:t>
+      </w:r>
+    </w:p>
+    <w:p>
+      <w:pPr>
+        <w:pStyle w:val="ListBullet"/>
+        <w:spacing w:after="40"/>
+      </w:pPr>
+      <w:r>
+        <w:rPr>
+          <w:b w:val="0"/>
+        </w:rPr>
+        <w:t>Zinsen mindern das Ergebnis und die Steuer, die Tilgung nur die Liquidität, die Restschuld das Gesamtvermögen. Ist der Kredit getilgt, entfallen Zins und Tilgung (Blatt Darlehen).</w:t>
       </w:r>
     </w:p>
     <w:p>
@@ -2122,7 +2262,7 @@
         <w:rPr>
           <w:b w:val="0"/>
         </w:rPr>
-        <w:t>Zinsen und Tilgung sind noch nicht enthalten (Betrachtung vor Finanzierung).</w:t>
+        <w:t>Zins und Tilgung gibt es nur für Kredite der Neuobjekte; Bestandsobjekte rechnen ohne Finanzierung.</w:t>
       </w:r>
     </w:p>
     <w:p>

</xml_diff>

<commit_message>
Selbstdokumentierende Mappe: Tooltips, Pflichtfelder, Kernparameter
Spaltenköpfe der Eingabeblätter zeigen Pflichtfelder (rot, *), optionale
Eingaben und berechnete Spalten (grau); Kommentare an den Köpfen erklären
Felder und Herleitungen, auch in Prognose, Rücklagen, Darlehen, Liquidität
und Auswertung. Parameterblatt: Kernparameter markiert, § 6b-Werte als
eigener Abschnitt, Abschnitte ohne Kernparameter eingeklappt, Wirkung je
Parameter als Kommentar. Texte zentral in prognosemodell/erklaerungen.py.

Co-Authored-By: Claude Opus 5.5 <noreply@anthropic.com>
Claude-Session: https://claude.ai/code/session_01HKaJyLE1UDFHJLz1dAoyYw
</commit_message>
<xml_diff>
--- a/docs/Bedienungsanleitung_Steuerberatung.docx
+++ b/docs/Bedienungsanleitung_Steuerberatung.docx
@@ -83,7 +83,7 @@
         <w:rPr>
           <w:b w:val="0"/>
         </w:rPr>
-        <w:t xml:space="preserve"> Blatt Parameter (Steuersatz, Steigerungen, Alternativrendite) und blaue Zellen im Blatt Objekte. Wo bessere Werte bekannt sind, eintippen.</w:t>
+        <w:t xml:space="preserve"> im Blatt Parameter zuerst die Kernparameter (★, fett: Steuersatz, Steigerungen, Alternativrendite), dann die blauen Zellen im Blatt Objekte. Wo bessere Werte bekannt sind, eintippen.</w:t>
       </w:r>
     </w:p>
     <w:p>
@@ -1217,6 +1217,20 @@
           <w:b w:val="0"/>
         </w:rPr>
         <w:t>Ein eingetippter Wert ersetzt die Annahme. Wird ein Feld geleert, stellt die Schaltfläche „Annahmen wiederherstellen“ die Annahme wieder her.</w:t>
+      </w:r>
+    </w:p>
+    <w:p>
+      <w:r>
+        <w:rPr>
+          <w:b/>
+        </w:rPr>
+        <w:t>Die Mappe erklärt sich selbst:</w:t>
+      </w:r>
+      <w:r>
+        <w:rPr>
+          <w:b w:val="0"/>
+        </w:rPr>
+        <w:t xml:space="preserve"> Spaltenköpfe in Objekte, Verkäufe, Neuobjekte und Anlagen sind rot mit * (Pflichtfeld), blau (optional) oder grau (berechnet). Ein rotes Dreieck am Kopf heißt: Maus darüber zeigt die Erläuterung, bei berechneten Spalten die Herleitung in Worten; das gilt auch für Prognose, Rücklagen, Darlehen, Liquidität und Auswertung. Im Blatt Parameter zeigt die Maus über der Bezeichnung, was der Parameter beeinflusst; Abschnitte ohne Kernparameter sind eingeklappt (+ am linken Rand).</w:t>
       </w:r>
     </w:p>
     <w:p>

</xml_diff>

<commit_message>
Darlehen der Bestandsobjekte: Zinsen fortschreiben, Tilgungsplan, Ablösung beim Verkauf
Blatt Objekte: Zinsaufwand Basisjahr (BWA 1310, mit dem Kostenstellenblatt
verknüpft), Restschuld Ende Basisjahr, Zinssatz und Rate (Annahmen bei Restschuld).
Ohne Restschuld wird der Zinsaufwand mit par_ZinsVeraenderung bis zum Verkauf
fortgeschrieben; mit Restschuld rechnet die Prognose Zins und Tilgung je Jahr und
löst die Restschuld im Verkaufsjahr ab. Baseline über neue Halten-Spalten, BWA 1310
für Bestandsobjekte, Sonderbereich mit Ablösung, zwei neue Prüfungen.

Co-Authored-By: Claude Opus 5.5 <noreply@anthropic.com>
Claude-Session: https://claude.ai/code/session_01HKaJyLE1UDFHJLz1dAoyYw
</commit_message>
<xml_diff>
--- a/docs/Bedienungsanleitung_Steuerberatung.docx
+++ b/docs/Bedienungsanleitung_Steuerberatung.docx
@@ -1274,7 +1274,7 @@
         <w:rPr>
           <w:b w:val="0"/>
         </w:rPr>
-        <w:t>Im Blatt Objekte verweisen Miete, Erhaltung, weitere Einnahmen und Ausgaben sowie die AfA lt. Buchhaltung auf das Kostenstellenblatt (grün).</w:t>
+        <w:t>Im Blatt Objekte verweisen Miete, Erhaltung, weitere Einnahmen und Ausgaben, die AfA lt. Buchhaltung und der Zinsaufwand (1310) auf das Kostenstellenblatt (grün).</w:t>
       </w:r>
     </w:p>
     <w:p>
@@ -1419,6 +1419,74 @@
           <w:b w:val="0"/>
         </w:rPr>
         <w:t>Zinsen mindern das Ergebnis und die Steuer, die Tilgung nur die Liquidität, die Restschuld das Gesamtvermögen. Ist der Kredit getilgt, entfallen Zins und Tilgung (Blatt Darlehen).</w:t>
+      </w:r>
+    </w:p>
+    <w:p>
+      <w:pPr>
+        <w:pStyle w:val="Heading2"/>
+      </w:pPr>
+      <w:r>
+        <w:t>Darlehen der Bestandsobjekte</w:t>
+      </w:r>
+    </w:p>
+    <w:p>
+      <w:pPr>
+        <w:pStyle w:val="ListBullet"/>
+        <w:spacing w:after="40"/>
+      </w:pPr>
+      <w:r>
+        <w:rPr>
+          <w:b/>
+        </w:rPr>
+        <w:t>Grob, ohne weitere Daten:</w:t>
+      </w:r>
+      <w:r>
+        <w:rPr>
+          <w:b w:val="0"/>
+        </w:rPr>
+        <w:t xml:space="preserve"> Der Zinsaufwand des Basisjahrs (BWA 1310) läuft bis zum Verkaufsjahr weiter und sinkt je Jahr um den Satz vom Parameterblatt (Standard 3 %). Tilgung und Ablösung beim Verkauf fehlen; die Prüfung weist darauf hin.</w:t>
+      </w:r>
+    </w:p>
+    <w:p>
+      <w:pPr>
+        <w:pStyle w:val="ListBullet"/>
+        <w:spacing w:after="40"/>
+      </w:pPr>
+      <w:r>
+        <w:rPr>
+          <w:b/>
+        </w:rPr>
+        <w:t>Genau:</w:t>
+      </w:r>
+      <w:r>
+        <w:rPr>
+          <w:b w:val="0"/>
+        </w:rPr>
+        <w:t xml:space="preserve"> Im Blatt Objekte die </w:t>
+      </w:r>
+      <w:r>
+        <w:rPr>
+          <w:b/>
+        </w:rPr>
+        <w:t>Restschuld zum 31.12.</w:t>
+      </w:r>
+      <w:r>
+        <w:rPr>
+          <w:b w:val="0"/>
+        </w:rPr>
+        <w:t xml:space="preserve"> des Basisjahrs eintragen (Saldenliste oder Bankauszug), möglichst auch Zinssatz und Jahresrate. Dann rechnet die Prognose Zins und Tilgung je Jahr und löst die Restschuld im Verkaufsjahr aus dem Erlös ab. Fehlen Zinssatz oder Rate, stehen Annahmen (blau) in den Zellen.</w:t>
+      </w:r>
+    </w:p>
+    <w:p>
+      <w:pPr>
+        <w:pStyle w:val="ListBullet"/>
+        <w:spacing w:after="40"/>
+      </w:pPr>
+      <w:r>
+        <w:rPr>
+          <w:b w:val="0"/>
+        </w:rPr>
+        <w:t>Eine Vorfälligkeitsentschädigung gehört in die Verkaufskosten.</w:t>
       </w:r>
     </w:p>
     <w:p>
@@ -1802,7 +1870,7 @@
         <w:rPr>
           <w:b w:val="0"/>
         </w:rPr>
-        <w:t xml:space="preserve"> Vorbesitzzeit für § 6b zu kurz, Rücklage nicht voll übertragen, Drei-Objekt-Grenze, Abweichung vom Kostenstellenblatt, unbekannte Neukauf-Kostenstelle.</w:t>
+        <w:t xml:space="preserve"> Vorbesitzzeit für § 6b zu kurz, Rücklage nicht voll übertragen, Drei-Objekt-Grenze, Abweichung vom Kostenstellenblatt, unbekannte Neukauf-Kostenstelle, Verkauf ohne Restschuld trotz Zinsaufwand.</w:t>
       </w:r>
     </w:p>
     <w:p>
@@ -2276,7 +2344,7 @@
         <w:rPr>
           <w:b w:val="0"/>
         </w:rPr>
-        <w:t>Zins und Tilgung gibt es nur für Kredite der Neuobjekte; Bestandsobjekte rechnen ohne Finanzierung.</w:t>
+        <w:t>Bei Objekten mit Darlehen die Restschuld eintragen, vor allem vor einem Verkauf: sonst fehlt die Ablösung, Liquidität und Kapitalanlage sind zu hoch.</w:t>
       </w:r>
     </w:p>
     <w:p>

</xml_diff>

<commit_message>
Übernahme: eingetippte Werte einer älteren Mappe übernehmen
python -m prognosemodell … --uebernehmen Alte_Mappe.xlsx schreibt die von
Hand eingetippten Werte (keine Formeln) der alten Mappe in die neu erzeugte:
Parameter, Objekte, Anlagen (Zuordnung, AfA von Hand), AfA-Plan,
Neukauf-KSt, Verkäufe, Neuobjekte, BWA-Zuordnung und Varianten. Spalten
werden über die Überschrift zugeordnet, Objekte, Anlagen und
Neukauf-Kostenstellen über ihre ID. Eingelesene Werte kommen aus der neuen
Kostenstellen-Datei, nur abweichend eingetippte bleiben.

Co-Authored-By: Claude Opus 5.5 <noreply@anthropic.com>
Claude-Session: https://claude.ai/code/session_011C3Etfnc6cffkiWfBazpr7
</commit_message>
<xml_diff>
--- a/docs/Bedienungsanleitung_Steuerberatung.docx
+++ b/docs/Bedienungsanleitung_Steuerberatung.docx
@@ -2359,6 +2359,88 @@
         <w:t>Alle Steuersätze, Fristen und Annahmen vor dem Echteinsatz durch den zuständigen Berufsträger prüfen.</w:t>
       </w:r>
     </w:p>
+    <w:p>
+      <w:pPr>
+        <w:pStyle w:val="Heading1"/>
+      </w:pPr>
+      <w:r>
+        <w:t>9. Neue Version der Mappe: Eingaben übernehmen</w:t>
+      </w:r>
+    </w:p>
+    <w:p>
+      <w:r>
+        <w:rPr>
+          <w:b w:val="0"/>
+        </w:rPr>
+        <w:t>Eine neue Version wird mit denselben Dateien erzeugt und bekommt die alte Mappe mit: python -m prognosemodell --kostenstellen Kostenstellen.xlsx --inventar Inventar.xlsx --uebernehmen Alte_Mappe.xlsx --ausgabe Neue_Mappe.xlsx. Die alte Mappe bleibt unverändert, der Bericht nennt je Blatt die übernommenen Werte.</w:t>
+      </w:r>
+    </w:p>
+    <w:p>
+      <w:pPr>
+        <w:pStyle w:val="ListBullet"/>
+        <w:spacing w:after="40"/>
+      </w:pPr>
+      <w:r>
+        <w:rPr>
+          <w:b/>
+        </w:rPr>
+        <w:t>Übernommen werden eingetippte Werte</w:t>
+      </w:r>
+      <w:r>
+        <w:rPr>
+          <w:b w:val="0"/>
+        </w:rPr>
+        <w:t xml:space="preserve"> aus Parameter, Objekte, Anlagen (Zuordnung zum Objekt, AfA von Hand), AfA-Plan, Neukauf-KSt, Verkäufe, Neuobjekte, BWA-Zuordnung und Varianten. Blaue Annahmen (Formeln) rechnet die neue Mappe selbst.</w:t>
+      </w:r>
+    </w:p>
+    <w:p>
+      <w:pPr>
+        <w:pStyle w:val="ListBullet"/>
+        <w:spacing w:after="40"/>
+      </w:pPr>
+      <w:r>
+        <w:rPr>
+          <w:b/>
+        </w:rPr>
+        <w:t>Spalten nach Überschrift:</w:t>
+      </w:r>
+      <w:r>
+        <w:rPr>
+          <w:b w:val="0"/>
+        </w:rPr>
+        <w:t xml:space="preserve"> neue Spalten einer neuen Version behalten ihre Vorbelegung; Spalten, die es nicht mehr gibt, meldet der Bericht.</w:t>
+      </w:r>
+    </w:p>
+    <w:p>
+      <w:pPr>
+        <w:pStyle w:val="ListBullet"/>
+        <w:spacing w:after="40"/>
+      </w:pPr>
+      <w:r>
+        <w:rPr>
+          <w:b/>
+        </w:rPr>
+        <w:t>Kostenstellen-Datei geht vor:</w:t>
+      </w:r>
+      <w:r>
+        <w:rPr>
+          <w:b w:val="0"/>
+        </w:rPr>
+        <w:t xml:space="preserve"> Werte, die beim Einlesen entstanden sind, kommen aus der neuen Kostenstellen-Datei; nur abweichend eingetippte Werte (orange) bleiben. Änderungen in den Kostenstellenblättern der Mappe werden nicht übernommen, dafür die Kostenstellen-Datei pflegen.</w:t>
+      </w:r>
+    </w:p>
+    <w:p>
+      <w:pPr>
+        <w:pStyle w:val="ListBullet"/>
+        <w:spacing w:after="40"/>
+      </w:pPr>
+      <w:r>
+        <w:rPr>
+          <w:b w:val="0"/>
+        </w:rPr>
+        <w:t>Verkäufe und Neuobjekte behalten ihre Zeilennummer (Rücklage und Reinvestition hängen daran); Objekte, Anlagen und Neukauf-Kostenstellen werden über ihre ID zugeordnet.</w:t>
+      </w:r>
+    </w:p>
     <w:sectPr>
       <w:pgSz w:w="12240" w:h="15840"/>
       <w:pgMar w:top="1134" w:right="1247" w:bottom="1134" w:left="1247" w:header="720" w:footer="720" w:gutter="0"/>

</xml_diff>

<commit_message>
Rücklage wirkt nur steuerlich: Verkaufserlös zur Finanzierung als eigenes Feld
Neuobjekte bekommen das Feld „Verkaufserlös zur Finanzierung“ (ja/nein). Nur mit „ja“
mindert der Nettoerlös der Quell-Verkäufe den Finanzierungsbedarf und damit den Kredit.
Leer oder „nein“: die Rücklage wirkt nur steuerlich (Übertragung, AfA-Basis), Kredit und
Eigenmittel richten sich nach der ganzen AK. Reinvestitionen aus „reinvestieren = ja“
sind mit „ja“ vorbelegt.

Co-Authored-By: Claude Opus 5.5 <noreply@anthropic.com>
Claude-Session: https://claude.ai/code/session_0184E7aQZHGuzPomRJFCQmY3
</commit_message>
<xml_diff>
--- a/docs/Bedienungsanleitung_Steuerberatung.docx
+++ b/docs/Bedienungsanleitung_Steuerberatung.docx
@@ -1364,13 +1364,31 @@
         <w:rPr>
           <w:b/>
         </w:rPr>
+        <w:t>Die Rücklage wirkt nur steuerlich</w:t>
+      </w:r>
+      <w:r>
+        <w:rPr>
+          <w:b w:val="0"/>
+        </w:rPr>
+        <w:t xml:space="preserve"> (Übertragung, AfA-Basis). Die Finanzierung legt man getrennt fest.</w:t>
+      </w:r>
+    </w:p>
+    <w:p>
+      <w:pPr>
+        <w:pStyle w:val="ListBullet"/>
+        <w:spacing w:after="40"/>
+      </w:pPr>
+      <w:r>
+        <w:rPr>
+          <w:b/>
+        </w:rPr>
         <w:t>Finanzierungsbedarf</w:t>
       </w:r>
       <w:r>
         <w:rPr>
           <w:b w:val="0"/>
         </w:rPr>
-        <w:t xml:space="preserve"> = Kaufpreis + Nebenkosten − Nettoerlös der Quell-Verkäufe.</w:t>
+        <w:t xml:space="preserve"> = Kaufpreis + Nebenkosten. Mit „Verkaufserlös zur Finanzierung = ja“ abzüglich des Nettoerlöses der Quell-Verkäufe; leer oder „nein“ = ganze AK.</w:t>
       </w:r>
     </w:p>
     <w:p>

</xml_diff>

<commit_message>
BWA: Halten-Ansicht „Alle Objekte halten“ und Vergleich mit Halten
Neues Blatt im Layout von Alle Objekte mit der Baseline (alle Bestandsobjekte
gehalten, ohne Verkäufe und Neuobjekte), Kontrolle gegen lqb_ZvE. In Alle
Objekte schaltet D3 „Vergleich mit Halten“ Differenzspalten Plan − Halten je
Position ein; --uebernehmen übernimmt den Schalter.

Co-Authored-By: Claude Opus 5.5 <noreply@anthropic.com>
Claude-Session: https://claude.ai/code/session_0184E7aQZHGuzPomRJFCQmY3
</commit_message>
<xml_diff>
--- a/docs/Bedienungsanleitung_Steuerberatung.docx
+++ b/docs/Bedienungsanleitung_Steuerberatung.docx
@@ -668,6 +668,54 @@
                 <w:sz w:val="19"/>
               </w:rPr>
               <w:t>Ist und Plan im BWA-Format je Kostenstelle und als Summe; Verkauf und Kauf als eigenes Blatt</w:t>
+            </w:r>
+          </w:p>
+        </w:tc>
+      </w:tr>
+      <w:tr>
+        <w:tc>
+          <w:tcPr>
+            <w:tcW w:type="dxa" w:w="2381"/>
+          </w:tcPr>
+          <w:p>
+            <w:pPr>
+              <w:keepNext/>
+              <w:spacing w:after="20"/>
+            </w:pPr>
+            <w:r>
+              <w:rPr>
+                <w:sz w:val="19"/>
+              </w:rPr>
+            </w:r>
+            <w:r>
+              <w:rPr>
+                <w:b/>
+                <w:sz w:val="19"/>
+              </w:rPr>
+              <w:t>Alle Objekte halten</w:t>
+            </w:r>
+          </w:p>
+        </w:tc>
+        <w:tc>
+          <w:tcPr>
+            <w:tcW w:type="dxa" w:w="7030"/>
+          </w:tcPr>
+          <w:p>
+            <w:pPr>
+              <w:keepNext/>
+              <w:spacing w:after="20"/>
+            </w:pPr>
+            <w:r>
+              <w:rPr>
+                <w:sz w:val="19"/>
+              </w:rPr>
+            </w:r>
+            <w:r>
+              <w:rPr>
+                <w:b w:val="0"/>
+                <w:sz w:val="19"/>
+              </w:rPr>
+              <w:t>Summe im BWA-Format als reine Halten-Ansicht: ohne Verkäufe und Käufe (Abschnitt 5)</w:t>
             </w:r>
           </w:p>
         </w:tc>
@@ -1587,6 +1635,42 @@
         <w:t xml:space="preserve"> mit „Variante festhalten“ gesicherte Stände, etwa verschiedene Verkaufsjahre.</w:t>
       </w:r>
     </w:p>
+    <w:p>
+      <w:pPr>
+        <w:pStyle w:val="ListBullet"/>
+        <w:spacing w:after="40"/>
+      </w:pPr>
+      <w:r>
+        <w:rPr>
+          <w:b/>
+        </w:rPr>
+        <w:t>Alle Objekte halten:</w:t>
+      </w:r>
+      <w:r>
+        <w:rPr>
+          <w:b w:val="0"/>
+        </w:rPr>
+        <w:t xml:space="preserve"> die Summen-BWA, als würden alle Objekte gehalten und nichts gekauft (Baseline).</w:t>
+      </w:r>
+    </w:p>
+    <w:p>
+      <w:pPr>
+        <w:pStyle w:val="ListBullet"/>
+        <w:spacing w:after="40"/>
+      </w:pPr>
+      <w:r>
+        <w:rPr>
+          <w:b/>
+        </w:rPr>
+        <w:t>Vergleich mit Halten:</w:t>
+      </w:r>
+      <w:r>
+        <w:rPr>
+          <w:b w:val="0"/>
+        </w:rPr>
+        <w:t xml:space="preserve"> in „Alle Objekte“ D3 auf „ja“ stellen. Rechts neben den Planjahren steht dann je Position und Jahr Plan − Halten, grün mehr, rot weniger.</w:t>
+      </w:r>
+    </w:p>
     <w:tbl>
       <w:tblPr>
         <w:tblStyle w:val="TableGrid"/>
@@ -2408,7 +2492,7 @@
         <w:rPr>
           <w:b w:val="0"/>
         </w:rPr>
-        <w:t xml:space="preserve"> aus Parameter, Objekte, Anlagen (Zuordnung zum Objekt, AfA von Hand), AfA-Plan, Neukauf-KSt, Verkäufe, Neuobjekte, BWA-Zuordnung und Varianten. Blaue Annahmen (Formeln) rechnet die neue Mappe selbst.</w:t>
+        <w:t xml:space="preserve"> aus Parameter, Objekte, Anlagen (Zuordnung zum Objekt, AfA von Hand), AfA-Plan, Neukauf-KSt, Verkäufe, Neuobjekte, BWA-Zuordnung, Schalter „Vergleich mit Halten“ und Varianten. Blaue Annahmen (Formeln) rechnet die neue Mappe selbst.</w:t>
       </w:r>
     </w:p>
     <w:p>

</xml_diff>

<commit_message>
Mandanten-Export: kompakte Fassung der Mappe, nur Werte
python -m prognosemodell.export MAPPE schreibt <Mappe>_Mandant.xlsx mit sechs
Blättern: Überblick, Jahresrechnung (Ergebnis, Steuer, Geldfluss, Vermögen je
Jahr, Plan und Halten), BWA gesamt, BWA je Objekt, Verkauf und Kauf, Annahmen
(Herkunft der Objektdaten als Farbe). Zeilen ohne Wert, Monatsspalten und
ausgeschaltete Vorgänge entfallen. Nie durchgerechnete Mappen rechnet
LibreOffice vorher durch.

Co-Authored-By: Claude Opus 5.5 <noreply@anthropic.com>
Claude-Session: https://claude.ai/code/session_0184E7aQZHGuzPomRJFCQmY3
</commit_message>
<xml_diff>
--- a/docs/Bedienungsanleitung_Steuerberatung.docx
+++ b/docs/Bedienungsanleitung_Steuerberatung.docx
@@ -2543,6 +2543,402 @@
         <w:t>Verkäufe und Neuobjekte behalten ihre Zeilennummer (Rücklage und Reinvestition hängen daran); Objekte, Anlagen und Neukauf-Kostenstellen werden über ihre ID zugeordnet.</w:t>
       </w:r>
     </w:p>
+    <w:p>
+      <w:pPr>
+        <w:pStyle w:val="Heading1"/>
+      </w:pPr>
+      <w:r>
+        <w:t>10. Mandanten-Export</w:t>
+      </w:r>
+    </w:p>
+    <w:p>
+      <w:r>
+        <w:rPr>
+          <w:b w:val="0"/>
+        </w:rPr>
+        <w:t>Für den Mandanten gibt es eine schlanke Fassung der Mappe mit sechs Blättern, nur mit Werten: Mappe in Excel speichern und schließen, dann python -m prognosemodell.export Prognose.xlsx. Daneben entsteht Prognose_Mandant.xlsx; mit --ausgabe ein anderer Name. Eine frisch erzeugte, nie geöffnete Mappe rechnet LibreOffice vorher durch.</w:t>
+      </w:r>
+    </w:p>
+    <w:tbl>
+      <w:tblPr>
+        <w:tblStyle w:val="TableGrid"/>
+        <w:tblW w:type="auto" w:w="0"/>
+        <w:jc w:val="center"/>
+        <w:tblLayout w:type="fixed"/>
+        <w:tblLook w:firstColumn="1" w:firstRow="1" w:lastColumn="0" w:lastRow="0" w:noHBand="0" w:noVBand="1" w:val="04A0"/>
+      </w:tblPr>
+      <w:tblGrid>
+        <w:gridCol w:w="2041"/>
+        <w:gridCol w:w="7370"/>
+      </w:tblGrid>
+      <w:tr>
+        <w:tc>
+          <w:tcPr>
+            <w:tcW w:type="dxa" w:w="2041"/>
+            <w:shd w:val="clear" w:fill="D9E2F3"/>
+          </w:tcPr>
+          <w:p>
+            <w:pPr>
+              <w:keepNext/>
+              <w:spacing w:after="20"/>
+            </w:pPr>
+            <w:r>
+              <w:rPr>
+                <w:sz w:val="19"/>
+              </w:rPr>
+            </w:r>
+            <w:r>
+              <w:rPr>
+                <w:b/>
+                <w:sz w:val="19"/>
+              </w:rPr>
+              <w:t>Blatt</w:t>
+            </w:r>
+          </w:p>
+        </w:tc>
+        <w:tc>
+          <w:tcPr>
+            <w:tcW w:type="dxa" w:w="7370"/>
+            <w:shd w:val="clear" w:fill="D9E2F3"/>
+          </w:tcPr>
+          <w:p>
+            <w:pPr>
+              <w:keepNext/>
+              <w:spacing w:after="20"/>
+            </w:pPr>
+            <w:r>
+              <w:rPr>
+                <w:sz w:val="19"/>
+              </w:rPr>
+            </w:r>
+            <w:r>
+              <w:rPr>
+                <w:b/>
+                <w:sz w:val="19"/>
+              </w:rPr>
+              <w:t>Inhalt</w:t>
+            </w:r>
+          </w:p>
+        </w:tc>
+      </w:tr>
+      <w:tr>
+        <w:tc>
+          <w:tcPr>
+            <w:tcW w:type="dxa" w:w="2041"/>
+          </w:tcPr>
+          <w:p>
+            <w:pPr>
+              <w:keepNext/>
+              <w:spacing w:after="20"/>
+            </w:pPr>
+            <w:r>
+              <w:rPr>
+                <w:sz w:val="19"/>
+              </w:rPr>
+            </w:r>
+            <w:r>
+              <w:rPr>
+                <w:b w:val="0"/>
+                <w:sz w:val="19"/>
+              </w:rPr>
+              <w:t>Überblick</w:t>
+            </w:r>
+          </w:p>
+        </w:tc>
+        <w:tc>
+          <w:tcPr>
+            <w:tcW w:type="dxa" w:w="7370"/>
+          </w:tcPr>
+          <w:p>
+            <w:pPr>
+              <w:keepNext/>
+              <w:spacing w:after="20"/>
+            </w:pPr>
+            <w:r>
+              <w:rPr>
+                <w:sz w:val="19"/>
+              </w:rPr>
+            </w:r>
+            <w:r>
+              <w:rPr>
+                <w:b w:val="0"/>
+                <w:sz w:val="19"/>
+              </w:rPr>
+              <w:t>Empfehlung, Endvermögen je Option, Datenlage, Verkehrswert und Gesamtvermögen je Jahr mit Diagrammen</w:t>
+            </w:r>
+          </w:p>
+        </w:tc>
+      </w:tr>
+      <w:tr>
+        <w:tc>
+          <w:tcPr>
+            <w:tcW w:type="dxa" w:w="2041"/>
+          </w:tcPr>
+          <w:p>
+            <w:pPr>
+              <w:keepNext/>
+              <w:spacing w:after="20"/>
+            </w:pPr>
+            <w:r>
+              <w:rPr>
+                <w:sz w:val="19"/>
+              </w:rPr>
+            </w:r>
+            <w:r>
+              <w:rPr>
+                <w:b w:val="0"/>
+                <w:sz w:val="19"/>
+              </w:rPr>
+              <w:t>Jahresrechnung</w:t>
+            </w:r>
+          </w:p>
+        </w:tc>
+        <w:tc>
+          <w:tcPr>
+            <w:tcW w:type="dxa" w:w="7370"/>
+          </w:tcPr>
+          <w:p>
+            <w:pPr>
+              <w:keepNext/>
+              <w:spacing w:after="20"/>
+            </w:pPr>
+            <w:r>
+              <w:rPr>
+                <w:sz w:val="19"/>
+              </w:rPr>
+            </w:r>
+            <w:r>
+              <w:rPr>
+                <w:b w:val="0"/>
+                <w:sz w:val="19"/>
+              </w:rPr>
+              <w:t>je Jahr vom Ergebnis über Steuer und Geldfluss zum Vermögen, Plan und Halten, Differenz; jede Spalte rechnet von oben nach unten</w:t>
+            </w:r>
+          </w:p>
+        </w:tc>
+      </w:tr>
+      <w:tr>
+        <w:tc>
+          <w:tcPr>
+            <w:tcW w:type="dxa" w:w="2041"/>
+          </w:tcPr>
+          <w:p>
+            <w:pPr>
+              <w:keepNext/>
+              <w:spacing w:after="20"/>
+            </w:pPr>
+            <w:r>
+              <w:rPr>
+                <w:sz w:val="19"/>
+              </w:rPr>
+            </w:r>
+            <w:r>
+              <w:rPr>
+                <w:b w:val="0"/>
+                <w:sz w:val="19"/>
+              </w:rPr>
+              <w:t>BWA gesamt</w:t>
+            </w:r>
+          </w:p>
+        </w:tc>
+        <w:tc>
+          <w:tcPr>
+            <w:tcW w:type="dxa" w:w="7370"/>
+          </w:tcPr>
+          <w:p>
+            <w:pPr>
+              <w:keepNext/>
+              <w:spacing w:after="20"/>
+            </w:pPr>
+            <w:r>
+              <w:rPr>
+                <w:sz w:val="19"/>
+              </w:rPr>
+            </w:r>
+            <w:r>
+              <w:rPr>
+                <w:b w:val="0"/>
+                <w:sz w:val="19"/>
+              </w:rPr>
+              <w:t>Summen-BWA aller Objekte, Ist-Jahre und Planjahre, Herleitung der Sonderposten; bei „Vergleich mit Halten = ja“ auch Halten und Differenz</w:t>
+            </w:r>
+          </w:p>
+        </w:tc>
+      </w:tr>
+      <w:tr>
+        <w:tc>
+          <w:tcPr>
+            <w:tcW w:type="dxa" w:w="2041"/>
+          </w:tcPr>
+          <w:p>
+            <w:pPr>
+              <w:keepNext/>
+              <w:spacing w:after="20"/>
+            </w:pPr>
+            <w:r>
+              <w:rPr>
+                <w:sz w:val="19"/>
+              </w:rPr>
+            </w:r>
+            <w:r>
+              <w:rPr>
+                <w:b w:val="0"/>
+                <w:sz w:val="19"/>
+              </w:rPr>
+              <w:t>BWA je Objekt</w:t>
+            </w:r>
+          </w:p>
+        </w:tc>
+        <w:tc>
+          <w:tcPr>
+            <w:tcW w:type="dxa" w:w="7370"/>
+          </w:tcPr>
+          <w:p>
+            <w:pPr>
+              <w:keepNext/>
+              <w:spacing w:after="20"/>
+            </w:pPr>
+            <w:r>
+              <w:rPr>
+                <w:sz w:val="19"/>
+              </w:rPr>
+            </w:r>
+            <w:r>
+              <w:rPr>
+                <w:b w:val="0"/>
+                <w:sz w:val="19"/>
+              </w:rPr>
+              <w:t>alle Kostenstellenblätter untereinander, mit Inhaltsverzeichnis</w:t>
+            </w:r>
+          </w:p>
+        </w:tc>
+      </w:tr>
+      <w:tr>
+        <w:tc>
+          <w:tcPr>
+            <w:tcW w:type="dxa" w:w="2041"/>
+          </w:tcPr>
+          <w:p>
+            <w:pPr>
+              <w:keepNext/>
+              <w:spacing w:after="20"/>
+            </w:pPr>
+            <w:r>
+              <w:rPr>
+                <w:sz w:val="19"/>
+              </w:rPr>
+            </w:r>
+            <w:r>
+              <w:rPr>
+                <w:b w:val="0"/>
+                <w:sz w:val="19"/>
+              </w:rPr>
+              <w:t>Verkauf und Kauf</w:t>
+            </w:r>
+          </w:p>
+        </w:tc>
+        <w:tc>
+          <w:tcPr>
+            <w:tcW w:type="dxa" w:w="7370"/>
+          </w:tcPr>
+          <w:p>
+            <w:pPr>
+              <w:keepNext/>
+              <w:spacing w:after="20"/>
+            </w:pPr>
+            <w:r>
+              <w:rPr>
+                <w:sz w:val="19"/>
+              </w:rPr>
+            </w:r>
+            <w:r>
+              <w:rPr>
+                <w:b w:val="0"/>
+                <w:sz w:val="19"/>
+              </w:rPr>
+              <w:t>Verkäufe, Neuobjekte, Ergebnis und Herleitung je Vorgang (entfällt ohne Verkauf und Kauf)</w:t>
+            </w:r>
+          </w:p>
+        </w:tc>
+      </w:tr>
+      <w:tr>
+        <w:tc>
+          <w:tcPr>
+            <w:tcW w:type="dxa" w:w="2041"/>
+          </w:tcPr>
+          <w:p>
+            <w:pPr>
+              <w:keepNext/>
+              <w:spacing w:after="20"/>
+            </w:pPr>
+            <w:r>
+              <w:rPr>
+                <w:sz w:val="19"/>
+              </w:rPr>
+            </w:r>
+            <w:r>
+              <w:rPr>
+                <w:b w:val="0"/>
+                <w:sz w:val="19"/>
+              </w:rPr>
+              <w:t>Annahmen</w:t>
+            </w:r>
+          </w:p>
+        </w:tc>
+        <w:tc>
+          <w:tcPr>
+            <w:tcW w:type="dxa" w:w="7370"/>
+          </w:tcPr>
+          <w:p>
+            <w:pPr>
+              <w:keepNext/>
+              <w:spacing w:after="20"/>
+            </w:pPr>
+            <w:r>
+              <w:rPr>
+                <w:sz w:val="19"/>
+              </w:rPr>
+            </w:r>
+            <w:r>
+              <w:rPr>
+                <w:b w:val="0"/>
+                <w:sz w:val="19"/>
+              </w:rPr>
+              <w:t>zentrale Annahmen, Daten je Objekt mit Herkunft (blau Annahme, grün Buchhaltung), auffällige Prüfungen</w:t>
+            </w:r>
+          </w:p>
+        </w:tc>
+      </w:tr>
+    </w:tbl>
+    <w:p>
+      <w:pPr>
+        <w:spacing w:after="0"/>
+      </w:pPr>
+    </w:p>
+    <w:p>
+      <w:pPr>
+        <w:pStyle w:val="ListBullet"/>
+        <w:spacing w:after="40"/>
+      </w:pPr>
+      <w:r>
+        <w:rPr>
+          <w:b w:val="0"/>
+        </w:rPr>
+        <w:t>Zeilen ohne Wert, Monatsspalten, Hilfszeilen und ausgeschaltete Vorgänge entfallen; Ist-Vorjahre erscheinen nur, wenn sie eingelesen sind.</w:t>
+      </w:r>
+    </w:p>
+    <w:p>
+      <w:pPr>
+        <w:pStyle w:val="ListBullet"/>
+        <w:spacing w:after="40"/>
+      </w:pPr>
+      <w:r>
+        <w:rPr>
+          <w:b w:val="0"/>
+        </w:rPr>
+        <w:t>Jedes Blatt ist für den Druck eingerichtet: Querformat, eine Seite breit, Blattname und Seitenzahl in der Fußzeile.</w:t>
+      </w:r>
+    </w:p>
     <w:sectPr>
       <w:pgSz w:w="12240" w:h="15840"/>
       <w:pgMar w:top="1134" w:right="1247" w:bottom="1134" w:left="1247" w:header="720" w:footer="720" w:gutter="0"/>

</xml_diff>

<commit_message>
Ergebnisbrücke und Kostenstellen der Art Unternehmen
Neues Ausgabeblatt Ergebnisbrücke: je Planjahr vom Ergebnis vor Steuern bei
Halten über die Wirkung jedes Verkaufs (Gewinn und Rücklage minus entfallendes
laufendes Ergebnis) und jedes Kaufs (Miete − Kosten − AfA − Kreditzinsen) und
den Zinseffekt der Liquidität zum Ergebnis vor Steuern im Plan A. Kontrollzeile
mit Prüfung; Steuer nachrichtlich. Dazu Prognosespalten ErgebnisHalten,
Wirkung, VerkaufNr und Unternehmen.

Blatt Objekte: Art der Kostenstelle (Immobilie/Unternehmen) für Kostenstellen
ohne Immobilie: kein Verkehrswert, getrennter Ausweis in der Brücke, Warnung
bei Verkauf. Mandanten-Export mit Blatt Ergebnisbrücke.

Co-Authored-By: Claude Opus 5.5 <noreply@anthropic.com>
Claude-Session: https://claude.ai/code/session_01UM7GbSjrQpSyW3L9SBqrmN
</commit_message>
<xml_diff>
--- a/docs/Bedienungsanleitung_Steuerberatung.docx
+++ b/docs/Bedienungsanleitung_Steuerberatung.docx
@@ -331,7 +331,7 @@
                 <w:b w:val="0"/>
                 <w:sz w:val="19"/>
               </w:rPr>
-              <w:t>Ein Bestandsobjekt je Zeile: Miete, Kosten, AK, Kaufjahr, Verkehrswert, Status</w:t>
+              <w:t>Ein Bestandsobjekt je Zeile: Miete, Kosten, AK, Kaufjahr, Verkehrswert, Status; Kostenstellen ohne Immobilie mit Art „Unternehmen“</w:t>
             </w:r>
           </w:p>
         </w:tc>
@@ -572,6 +572,54 @@
                 <w:sz w:val="19"/>
               </w:rPr>
               <w:t>Ergebnis je Jahr und Szenarien nebeneinander (Abschnitt 5)</w:t>
+            </w:r>
+          </w:p>
+        </w:tc>
+      </w:tr>
+      <w:tr>
+        <w:tc>
+          <w:tcPr>
+            <w:tcW w:type="dxa" w:w="2381"/>
+          </w:tcPr>
+          <w:p>
+            <w:pPr>
+              <w:keepNext/>
+              <w:spacing w:after="20"/>
+            </w:pPr>
+            <w:r>
+              <w:rPr>
+                <w:sz w:val="19"/>
+              </w:rPr>
+            </w:r>
+            <w:r>
+              <w:rPr>
+                <w:b/>
+                <w:sz w:val="19"/>
+              </w:rPr>
+              <w:t>Ergebnisbrücke</w:t>
+            </w:r>
+          </w:p>
+        </w:tc>
+        <w:tc>
+          <w:tcPr>
+            <w:tcW w:type="dxa" w:w="7030"/>
+          </w:tcPr>
+          <w:p>
+            <w:pPr>
+              <w:keepNext/>
+              <w:spacing w:after="20"/>
+            </w:pPr>
+            <w:r>
+              <w:rPr>
+                <w:sz w:val="19"/>
+              </w:rPr>
+            </w:r>
+            <w:r>
+              <w:rPr>
+                <w:b w:val="0"/>
+                <w:sz w:val="19"/>
+              </w:rPr>
+              <w:t>Wirkung jedes Verkaufs und Kaufs auf das Ergebnis vor Steuern, von Halten zum Plan (Abschnitt 5)</w:t>
             </w:r>
           </w:p>
         </w:tc>
@@ -1626,6 +1674,24 @@
         <w:rPr>
           <w:b/>
         </w:rPr>
+        <w:t>Ergebnisbrücke:</w:t>
+      </w:r>
+      <w:r>
+        <w:rPr>
+          <w:b w:val="0"/>
+        </w:rPr>
+        <w:t xml:space="preserve"> je Jahr vom Ergebnis vor Steuern bei Halten über die Wirkung jedes Verkaufs (Gewinn und Rücklage minus das entfallende laufende Ergebnis) und jedes Kaufs (Miete − Kosten − AfA − Kreditzinsen) und den Zinseffekt der Liquidität zum Ergebnis vor Steuern im Plan. Die Kontrollzeile muss 0 sein. Kostenstellen der Art „Unternehmen“ (Blatt Objekte, keine Immobilie) stehen getrennt im Ergebnis bei Halten.</w:t>
+      </w:r>
+    </w:p>
+    <w:p>
+      <w:pPr>
+        <w:pStyle w:val="ListBullet"/>
+        <w:spacing w:after="40"/>
+      </w:pPr>
+      <w:r>
+        <w:rPr>
+          <w:b/>
+        </w:rPr>
         <w:t>Varianten:</w:t>
       </w:r>
       <w:r>
@@ -2556,7 +2622,7 @@
         <w:rPr>
           <w:b w:val="0"/>
         </w:rPr>
-        <w:t>Für den Mandanten gibt es eine schlanke Fassung der Mappe mit sechs Blättern, nur mit Werten: Mappe in Excel speichern und schließen, dann python -m prognosemodell.export Prognose.xlsx. Daneben entsteht Prognose_Mandant.xlsx; mit --ausgabe ein anderer Name. Eine frisch erzeugte, nie geöffnete Mappe rechnet LibreOffice vorher durch.</w:t>
+        <w:t>Für den Mandanten gibt es eine schlanke Fassung der Mappe mit bis zu sieben Blättern, nur mit Werten: Mappe in Excel speichern und schließen, dann python -m prognosemodell.export Prognose.xlsx. Daneben entsteht Prognose_Mandant.xlsx; mit --ausgabe ein anderer Name. Eine frisch erzeugte, nie geöffnete Mappe rechnet LibreOffice vorher durch.</w:t>
       </w:r>
     </w:p>
     <w:tbl>
@@ -2713,6 +2779,54 @@
                 <w:sz w:val="19"/>
               </w:rPr>
               <w:t>je Jahr vom Ergebnis über Steuer und Geldfluss zum Vermögen, Plan und Halten, Differenz; jede Spalte rechnet von oben nach unten</w:t>
+            </w:r>
+          </w:p>
+        </w:tc>
+      </w:tr>
+      <w:tr>
+        <w:tc>
+          <w:tcPr>
+            <w:tcW w:type="dxa" w:w="2041"/>
+          </w:tcPr>
+          <w:p>
+            <w:pPr>
+              <w:keepNext/>
+              <w:spacing w:after="20"/>
+            </w:pPr>
+            <w:r>
+              <w:rPr>
+                <w:sz w:val="19"/>
+              </w:rPr>
+            </w:r>
+            <w:r>
+              <w:rPr>
+                <w:b w:val="0"/>
+                <w:sz w:val="19"/>
+              </w:rPr>
+              <w:t>Ergebnisbrücke</w:t>
+            </w:r>
+          </w:p>
+        </w:tc>
+        <w:tc>
+          <w:tcPr>
+            <w:tcW w:type="dxa" w:w="7370"/>
+          </w:tcPr>
+          <w:p>
+            <w:pPr>
+              <w:keepNext/>
+              <w:spacing w:after="20"/>
+            </w:pPr>
+            <w:r>
+              <w:rPr>
+                <w:sz w:val="19"/>
+              </w:rPr>
+            </w:r>
+            <w:r>
+              <w:rPr>
+                <w:b w:val="0"/>
+                <w:sz w:val="19"/>
+              </w:rPr>
+              <w:t>vom Ergebnis bei Halten je Verkauf und Kauf zum Ergebnis im Plan (entfällt ohne Verkauf und Kauf)</w:t>
             </w:r>
           </w:p>
         </w:tc>

</xml_diff>

<commit_message>
Finanzierung: Zweitkredit und tilgungsfreie Jahre
Ein Teil des Kredits kann zu eigenen Konditionen laufen (z. B. Förderkredit):
Zweitkredit Anteil oder Betrag, Zinssatz, Tilgungsart, Tilgung, Laufzeit und
tilgungsfreie Jahre (leer = wie Hauptkredit). Der Kredit insgesamt bleibt gleich;
das Blatt Darlehen führt die Zweitkredite unter den Hauptkrediten, die Prognose
summiert beide. Tilgungsfreie Jahre gibt es auch für den Hauptkredit.

Co-Authored-By: Claude Opus 5.5 <noreply@anthropic.com>
Claude-Session: https://claude.ai/code/session_01UM7GbSjrQpSyW3L9SBqrmN
</commit_message>
<xml_diff>
--- a/docs/Bedienungsanleitung_Steuerberatung.docx
+++ b/docs/Bedienungsanleitung_Steuerberatung.docx
@@ -1520,7 +1520,25 @@
         <w:rPr>
           <w:b w:val="0"/>
         </w:rPr>
-        <w:t xml:space="preserve"> Zinssatz, Tilgungsart (Annuität mit anfänglicher Tilgung, linear oder endfällig), Tilgung p. a., optional die Laufzeit, nach der die Restschuld getilgt wird.</w:t>
+        <w:t xml:space="preserve"> Zinssatz, Tilgungsart (Annuität mit anfänglicher Tilgung, linear oder endfällig), Tilgung p. a., optional die Laufzeit, nach der die Restschuld getilgt wird, und tilgungsfreie Jahre (anfangs nur Zins).</w:t>
+      </w:r>
+    </w:p>
+    <w:p>
+      <w:pPr>
+        <w:pStyle w:val="ListBullet"/>
+        <w:spacing w:after="40"/>
+      </w:pPr>
+      <w:r>
+        <w:rPr>
+          <w:b/>
+        </w:rPr>
+        <w:t>Zweitkredit:</w:t>
+      </w:r>
+      <w:r>
+        <w:rPr>
+          <w:b w:val="0"/>
+        </w:rPr>
+        <w:t xml:space="preserve"> Ein Teil des Kredits zu eigenen Konditionen, z. B. ein günstiger Förderkredit. „Zweitkredit Anteil“ (in % des Kredits) oder „Zweitkredit Betrag“ (geht vor) und der Zinssatz; Tilgungsart, Tilgung, Laufzeit und tilgungsfreie Jahre leer = wie der Hauptkredit. Der Kredit insgesamt bleibt gleich, im Blatt Darlehen stehen die Zweitkredite unter den Hauptkrediten.</w:t>
       </w:r>
     </w:p>
     <w:p>

</xml_diff>

<commit_message>
Objekte: eigene Miet- und Erhaltungssteigerung, Miete einfrieren
Neue Spalten im Blatt Objekte: Mietsteigerung und Erhaltungssteigerung p. a.
(vorbelegt mit dem Parameter, überschreibbar, leer = Parameter) und „Miete
eingefroren ab Jahr“. Die Prognose führt Miete und weitere Einnahmen bei Halten
je Objekt (prg_MieteHalten, prg_EinnahmenHalten); Baseline, „Alle Objekte
halten“ und der Ausgangsfall im Sonderbereich summieren diese Spalten.

Co-Authored-By: Claude Opus 5.5 <noreply@anthropic.com>
Claude-Session: https://claude.ai/code/session_01UM7GbSjrQpSyW3L9SBqrmN
</commit_message>
<xml_diff>
--- a/docs/Bedienungsanleitung_Steuerberatung.docx
+++ b/docs/Bedienungsanleitung_Steuerberatung.docx
@@ -1407,6 +1407,24 @@
           <w:b w:val="0"/>
         </w:rPr>
         <w:t>Die Monatsspalten des Basisjahrs sind eingeklappt; das „+“ über der Jahresspalte öffnet sie.</w:t>
+      </w:r>
+    </w:p>
+    <w:p>
+      <w:pPr>
+        <w:pStyle w:val="ListBullet"/>
+        <w:spacing w:after="40"/>
+      </w:pPr>
+      <w:r>
+        <w:rPr>
+          <w:b/>
+        </w:rPr>
+        <w:t>Steigerung je Objekt:</w:t>
+      </w:r>
+      <w:r>
+        <w:rPr>
+          <w:b w:val="0"/>
+        </w:rPr>
+        <w:t xml:space="preserve"> Die Spalten Mietsteigerung und Erhaltungssteigerung im Blatt Objekte sind mit dem Parameter vorbelegt (blau) und lassen sich je Objekt überschreiben; leer gilt wieder der Parameter. „Miete eingefroren ab Jahr“: ab diesem Jahr bleibt die Miete auf dem Stand des Vorjahrs (weitere Einnahmen steigen weiter).</w:t>
       </w:r>
     </w:p>
     <w:p>

</xml_diff>

<commit_message>
Mandanten-Export: Blatt BWA halten (Status quo)
Neues Blatt „BWA halten“: „Alle Objekte halten“ wie die BWA gesamt aufbereitet,
unabhängig von „Vergleich mit Halten“. Es entfällt, wenn es der BWA gesamt gleicht
(ohne Verkauf und Kauf). Die BWA gesamt zeigt bei „Vergleich mit Halten = ja“ nur
noch die Differenz; Halten selbst steht im neuen Blatt.

Co-Authored-By: Claude Opus 5.5 <noreply@anthropic.com>
Claude-Session: https://claude.ai/code/session_01UM7GbSjrQpSyW3L9SBqrmN
</commit_message>
<xml_diff>
--- a/docs/Bedienungsanleitung_Steuerberatung.docx
+++ b/docs/Bedienungsanleitung_Steuerberatung.docx
@@ -2658,7 +2658,7 @@
         <w:rPr>
           <w:b w:val="0"/>
         </w:rPr>
-        <w:t>Für den Mandanten gibt es eine schlanke Fassung der Mappe mit bis zu sieben Blättern, nur mit Werten: Mappe in Excel speichern und schließen, dann python -m prognosemodell.export Prognose.xlsx. Daneben entsteht Prognose_Mandant.xlsx; mit --ausgabe ein anderer Name. Eine frisch erzeugte, nie geöffnete Mappe rechnet LibreOffice vorher durch.</w:t>
+        <w:t>Für den Mandanten gibt es eine schlanke Fassung der Mappe mit bis zu acht Blättern, nur mit Werten: Mappe in Excel speichern und schließen, dann python -m prognosemodell.export Prognose.xlsx. Daneben entsteht Prognose_Mandant.xlsx; mit --ausgabe ein anderer Name. Eine frisch erzeugte, nie geöffnete Mappe rechnet LibreOffice vorher durch.</w:t>
       </w:r>
     </w:p>
     <w:tbl>
@@ -2910,7 +2910,55 @@
                 <w:b w:val="0"/>
                 <w:sz w:val="19"/>
               </w:rPr>
-              <w:t>Summen-BWA aller Objekte, Ist-Jahre und Planjahre, Herleitung der Sonderposten; bei „Vergleich mit Halten = ja“ auch Halten und Differenz</w:t>
+              <w:t>Summen-BWA aller Objekte, Ist-Jahre und Planjahre, Herleitung der Sonderposten; bei „Vergleich mit Halten = ja“ auch die Differenz zu Halten</w:t>
+            </w:r>
+          </w:p>
+        </w:tc>
+      </w:tr>
+      <w:tr>
+        <w:tc>
+          <w:tcPr>
+            <w:tcW w:type="dxa" w:w="2041"/>
+          </w:tcPr>
+          <w:p>
+            <w:pPr>
+              <w:keepNext/>
+              <w:spacing w:after="20"/>
+            </w:pPr>
+            <w:r>
+              <w:rPr>
+                <w:sz w:val="19"/>
+              </w:rPr>
+            </w:r>
+            <w:r>
+              <w:rPr>
+                <w:b w:val="0"/>
+                <w:sz w:val="19"/>
+              </w:rPr>
+              <w:t>BWA halten</w:t>
+            </w:r>
+          </w:p>
+        </w:tc>
+        <w:tc>
+          <w:tcPr>
+            <w:tcW w:type="dxa" w:w="7370"/>
+          </w:tcPr>
+          <w:p>
+            <w:pPr>
+              <w:keepNext/>
+              <w:spacing w:after="20"/>
+            </w:pPr>
+            <w:r>
+              <w:rPr>
+                <w:sz w:val="19"/>
+              </w:rPr>
+            </w:r>
+            <w:r>
+              <w:rPr>
+                <w:b w:val="0"/>
+                <w:sz w:val="19"/>
+              </w:rPr>
+              <w:t>dieselbe Summen-BWA als Status quo: alle Objekte behalten, ohne Verkäufe und Neuobjekte (entfällt ohne Verkauf und Kauf)</w:t>
             </w:r>
           </w:p>
         </w:tc>

</xml_diff>

<commit_message>
Zweitkredit: Restschuld nach Laufzeit auf den Hauptkredit übernehmen
Neue Eingabe „Restschuld Zweitkredit nach Laufzeit“ (ablösen / auf Hauptkredit).
Mit „auf Hauptkredit“ zahlt der Zweitkredit im letzten Laufzeitjahr die reguläre Rate,
die Restschuld geht zum Jahresende auf den Hauptkredit über. Dessen Rate steigt ab dem
Folgejahr um übernommener Betrag × (Zins + Tilgung), linear um Betrag × Tilgung. Kein
Geldfluss in der Liquidität. Blatt Darlehen: Übernahmejahr, Betrag, Rate ab Übernahme.

Co-Authored-By: Claude Opus 5.5 <noreply@anthropic.com>
Claude-Session: https://claude.ai/code/session_01LCUNNgQDmDLvk89gY7vima
</commit_message>
<xml_diff>
--- a/docs/Bedienungsanleitung_Steuerberatung.docx
+++ b/docs/Bedienungsanleitung_Steuerberatung.docx
@@ -1557,6 +1557,24 @@
           <w:b w:val="0"/>
         </w:rPr>
         <w:t xml:space="preserve"> Ein Teil des Kredits zu eigenen Konditionen, z. B. ein günstiger Förderkredit. „Zweitkredit Anteil“ (in % des Kredits) oder „Zweitkredit Betrag“ (geht vor) und der Zinssatz; Tilgungsart, Tilgung, Laufzeit und tilgungsfreie Jahre leer = wie der Hauptkredit. Der Kredit insgesamt bleibt gleich, im Blatt Darlehen stehen die Zweitkredite unter den Hauptkrediten.</w:t>
+      </w:r>
+    </w:p>
+    <w:p>
+      <w:pPr>
+        <w:pStyle w:val="ListBullet"/>
+        <w:spacing w:after="40"/>
+      </w:pPr>
+      <w:r>
+        <w:rPr>
+          <w:b/>
+        </w:rPr>
+        <w:t>Restschuld des Zweitkredits nach der Laufzeit:</w:t>
+      </w:r>
+      <w:r>
+        <w:rPr>
+          <w:b w:val="0"/>
+        </w:rPr>
+        <w:t xml:space="preserve"> leer bzw. „ablösen“ tilgt sie nach der Laufzeit auf einmal aus der Liquidität. „auf Hauptkredit“ finanziert sie über den Hauptkredit weiter: Zum Ende des letzten Laufzeitjahrs (nach der regulären Rate) geht sie auf den Hauptkredit über, dessen Rate ab dem Folgejahr um übernommener Betrag × (Zinssatz + Tilgung) steigt, bei linearer Tilgung um Betrag × Tilgung. Braucht eine Laufzeit; das Blatt Darlehen zeigt Übernahmejahr, Betrag und neue Rate.</w:t>
       </w:r>
     </w:p>
     <w:p>

</xml_diff>

<commit_message>
Übersichtskostenstellen: Summe mehrerer Kostenstellen eines Gebäudes
Neuer Parameter --uebersicht "NAME=KST,KST,..." (mehrfach möglich). Je Übersicht ein
BWA-Blatt hinter der letzten seiner Kostenstellen, das deren Blätter Zelle für Zelle
summiert (Ist, Basisjahr, Plan, Herleitung, Finanzierung). Kein anderes Blatt verweist
darauf, die Rechnung und „Alle Objekte“ bleiben unverändert. Im Mandanten-Export
erscheint die Übersicht unter BWA je Objekt mit den Kostenstellen im Titel.

Co-Authored-By: Claude Opus 5.5 <noreply@anthropic.com>
Claude-Session: https://claude.ai/code/session_01LCUNNgQDmDLvk89gY7vima
</commit_message>
<xml_diff>
--- a/docs/Bedienungsanleitung_Steuerberatung.docx
+++ b/docs/Bedienungsanleitung_Steuerberatung.docx
@@ -2664,6 +2664,20 @@
       </w:r>
     </w:p>
     <w:p>
+      <w:r>
+        <w:rPr>
+          <w:b/>
+        </w:rPr>
+        <w:t>Übersichtskostenstelle:</w:t>
+      </w:r>
+      <w:r>
+        <w:rPr>
+          <w:b w:val="0"/>
+        </w:rPr>
+        <w:t xml:space="preserve"> Gehören mehrere Kostenstellen zu einem Gebäude, fasst --uebersicht "Musterstraße 5=KSt 10,KSt 11" sie in einem eigenen BWA-Blatt zusammen (mehrfach möglich; ObjektID oder Blattname). Das Blatt summiert nur die Kostenstellenblätter, rechnet nicht mit und erscheint im Mandanten-Export unter BWA je Objekt.</w:t>
+      </w:r>
+    </w:p>
+    <w:p>
       <w:pPr>
         <w:pStyle w:val="Heading1"/>
       </w:pPr>
@@ -3024,7 +3038,7 @@
                 <w:b w:val="0"/>
                 <w:sz w:val="19"/>
               </w:rPr>
-              <w:t>alle Kostenstellenblätter untereinander, mit Inhaltsverzeichnis</w:t>
+              <w:t>alle Kostenstellenblätter untereinander, mit Inhaltsverzeichnis; dazu die Übersichtskostenstellen</w:t>
             </w:r>
           </w:p>
         </w:tc>

</xml_diff>

<commit_message>
Neuobjekte: eigene Mietsteigerung und Jahre ohne Mietsteigerung
- Parameter „Mietsteigerung Neuobjekte p. a.“ (par_NeuMietsteig), getrennt vom Bestand
- Blatt Neuobjekte: „Mietsteigerung p. a.“ je Neuobjekt (leer = Parameter) und
  „Mietsteigerung erst nach Jahren“, z. B. 10 bei Neubau oder Staffelmiete über dem
  Mietspiegel: so lange bleibt die Miete nach dem Kauf auf dem Anfangsstand
- Neukauf-KSt: Annahme und Fortschreibung mit Satz und Wartejahren des Neuobjekts
- Übernahme einer alten Mappe: par_NeuMietsteig = deren Mietsteigerung
- Prüfungen, README, Projektplan (Abschnitt 34), Bedienungsanleitung

Co-Authored-By: Claude Opus 5.5 <noreply@anthropic.com>
Claude-Session: https://claude.ai/code/session_01LCUNNgQDmDLvk89gY7vima
</commit_message>
<xml_diff>
--- a/docs/Bedienungsanleitung_Steuerberatung.docx
+++ b/docs/Bedienungsanleitung_Steuerberatung.docx
@@ -1425,6 +1425,24 @@
           <w:b w:val="0"/>
         </w:rPr>
         <w:t xml:space="preserve"> Die Spalten Mietsteigerung und Erhaltungssteigerung im Blatt Objekte sind mit dem Parameter vorbelegt (blau) und lassen sich je Objekt überschreiben; leer gilt wieder der Parameter. „Miete eingefroren ab Jahr“: ab diesem Jahr bleibt die Miete auf dem Stand des Vorjahrs (weitere Einnahmen steigen weiter).</w:t>
+      </w:r>
+    </w:p>
+    <w:p>
+      <w:pPr>
+        <w:pStyle w:val="ListBullet"/>
+        <w:spacing w:after="40"/>
+      </w:pPr>
+      <w:r>
+        <w:rPr>
+          <w:b/>
+        </w:rPr>
+        <w:t>Mietsteigerung der Neuobjekte:</w:t>
+      </w:r>
+      <w:r>
+        <w:rPr>
+          <w:b w:val="0"/>
+        </w:rPr>
+        <w:t xml:space="preserve"> eigener Parameter „Mietsteigerung Neuobjekte p. a.“, getrennt vom Bestand. Im Blatt Neuobjekte kann jedes Neuobjekt einen eigenen Satz haben (leer = Parameter). „Mietsteigerung erst nach Jahren“, z. B. 10 bei Neubau oder Staffelmiete über dem Mietspiegel: so viele Jahre nach dem Kauf bleibt die Miete auf dem Anfangsstand und steigt erst danach. Das gilt auch für die Fortschreibung im Blatt Neukauf-KSt.</w:t>
       </w:r>
     </w:p>
     <w:p>

</xml_diff>

<commit_message>
Blatt Cashflow: Kapitalflussrechnung je Jahr mit Diagramm
- Neues Blatt Cashflow (hinter der Ergebnisbrücke), Szenario per Auswahlliste:
  operativer Cashflow indirekt vom Jahresüberschuss (+ AfA − Veräußerungsgewinne
  + Einstellung § 6b-Rücklage − Auflösung − Zuschlag), dazu direkt aufgeteilt
  inkl. Zinsen; Investition, Finanzierung, Liquidität Anfang/Ende mit Kontrolle
- Kennzahlen: Free Cashflow, Kapitaldienst, Cashflow nach Kapitaldienst,
  Kapitaldienstdeckung (unter 1 rot); Säulen-/Liniendiagramm
- Ablösung bei Verkauf getrennt von der planmäßigen Tilgung (prg_Abloesung,
  *_Abloesung im Blatt Liquidität)
- Prüfungen „cashflow“ (Fehler) und „kapitaldienst“ (Hinweis)
- Prüffälle je Szenario und für Kapitaldienstdeckung unter 1; Doku

Co-Authored-By: Claude Opus 5.5 <noreply@anthropic.com>
Claude-Session: https://claude.ai/code/session_01LCUNNgQDmDLvk89gY7vima
</commit_message>
<xml_diff>
--- a/docs/Bedienungsanleitung_Steuerberatung.docx
+++ b/docs/Bedienungsanleitung_Steuerberatung.docx
@@ -620,6 +620,54 @@
                 <w:sz w:val="19"/>
               </w:rPr>
               <w:t>Wirkung jedes Verkaufs und Kaufs auf das Ergebnis vor Steuern, von Halten zum Plan (Abschnitt 5)</w:t>
+            </w:r>
+          </w:p>
+        </w:tc>
+      </w:tr>
+      <w:tr>
+        <w:tc>
+          <w:tcPr>
+            <w:tcW w:type="dxa" w:w="2381"/>
+          </w:tcPr>
+          <w:p>
+            <w:pPr>
+              <w:keepNext/>
+              <w:spacing w:after="20"/>
+            </w:pPr>
+            <w:r>
+              <w:rPr>
+                <w:sz w:val="19"/>
+              </w:rPr>
+            </w:r>
+            <w:r>
+              <w:rPr>
+                <w:b/>
+                <w:sz w:val="19"/>
+              </w:rPr>
+              <w:t>Cashflow</w:t>
+            </w:r>
+          </w:p>
+        </w:tc>
+        <w:tc>
+          <w:tcPr>
+            <w:tcW w:type="dxa" w:w="7030"/>
+          </w:tcPr>
+          <w:p>
+            <w:pPr>
+              <w:keepNext/>
+              <w:spacing w:after="20"/>
+            </w:pPr>
+            <w:r>
+              <w:rPr>
+                <w:sz w:val="19"/>
+              </w:rPr>
+            </w:r>
+            <w:r>
+              <w:rPr>
+                <w:b w:val="0"/>
+                <w:sz w:val="19"/>
+              </w:rPr>
+              <w:t>Kapitalflussrechnung je Jahr für ein wählbares Szenario: operativ, Investition, Finanzierung, Kapitaldienst, Diagramm (Abschnitt 5)</w:t>
             </w:r>
           </w:p>
         </w:tc>
@@ -1753,6 +1801,24 @@
           <w:b w:val="0"/>
         </w:rPr>
         <w:t xml:space="preserve"> je Jahr vom Ergebnis vor Steuern bei Halten über die Pakete und den Zinseffekt der Liquidität zum Ergebnis vor Steuern im Plan. Ein Paket ist ein Verkauf (Gewinn und Rücklage minus das entfallende laufende Ergebnis) mit den Käufen aus seiner Rücklage oder seinem Erlös (Miete − Kosten − AfA − Kreditzinsen), mit Zwischensumme; Käufe ohne Quelle stehen getrennt, darunter alle Käufe einzeln mit ihrem Paket. Die Kontrollzeile muss 0 sein. Kostenstellen der Art „Unternehmen“ (Blatt Objekte, keine Immobilie) stehen getrennt im Ergebnis bei Halten.</w:t>
+      </w:r>
+    </w:p>
+    <w:p>
+      <w:pPr>
+        <w:pStyle w:val="ListBullet"/>
+        <w:spacing w:after="40"/>
+      </w:pPr>
+      <w:r>
+        <w:rPr>
+          <w:b/>
+        </w:rPr>
+        <w:t>Cashflow:</w:t>
+      </w:r>
+      <w:r>
+        <w:rPr>
+          <w:b w:val="0"/>
+        </w:rPr>
+        <w:t xml:space="preserve"> Kapitalflussrechnung je Jahr; das Szenario wählen Sie in Zelle B3. Der operative Cashflow rechnet indirekt vom Jahresüberschuss: plus AfA, minus Veräußerungsgewinne, plus Einstellung in die § 6b-Rücklage, minus Auflösung und Gewinnzuschlag. Darunter Investition (Verkaufserlöse, Käufe) und Finanzierung (Kreditauszahlung, planmäßige Tilgung, Ablösung bei Verkauf), die Liquidität am Jahresende und die Kapitaldienstdeckung (Einnahmen − Ausgaben je Euro Zins und Tilgung, unter 1 rot). Das Diagramm zeigt die drei Bereiche als Säulen und die Liquidität als Linie.</w:t>
       </w:r>
     </w:p>
     <w:p>

</xml_diff>

<commit_message>
Mandanten-Export: Blatt Cashflow mit Diagramm
Der Export übernimmt das Blatt Cashflow für das in der Mappe gewählte
Szenario: Jahre, Summe, Kennzahlen und das Diagramm; ohne Kontrollzeile,
Nullzeilen entfallen bis auf die Summenzeilen.

Co-Authored-By: Claude Opus 5.5 <noreply@anthropic.com>
Claude-Session: https://claude.ai/code/session_01LCUNNgQDmDLvk89gY7vima
</commit_message>
<xml_diff>
--- a/docs/Bedienungsanleitung_Steuerberatung.docx
+++ b/docs/Bedienungsanleitung_Steuerberatung.docx
@@ -2774,7 +2774,7 @@
         <w:rPr>
           <w:b w:val="0"/>
         </w:rPr>
-        <w:t>Für den Mandanten gibt es eine schlanke Fassung der Mappe mit bis zu acht Blättern, nur mit Werten: Mappe in Excel speichern und schließen, dann python -m prognosemodell.export Prognose.xlsx. Daneben entsteht Prognose_Mandant.xlsx; mit --ausgabe ein anderer Name. Eine frisch erzeugte, nie geöffnete Mappe rechnet LibreOffice vorher durch.</w:t>
+        <w:t>Für den Mandanten gibt es eine schlanke Fassung der Mappe mit bis zu neun Blättern, nur mit Werten: Mappe in Excel speichern und schließen, dann python -m prognosemodell.export Prognose.xlsx. Daneben entsteht Prognose_Mandant.xlsx; mit --ausgabe ein anderer Name. Eine frisch erzeugte, nie geöffnete Mappe rechnet LibreOffice vorher durch.</w:t>
       </w:r>
     </w:p>
     <w:tbl>
@@ -2979,6 +2979,54 @@
                 <w:sz w:val="19"/>
               </w:rPr>
               <w:t>vom Ergebnis bei Halten je Verkauf und Kauf zum Ergebnis im Plan (entfällt ohne Verkauf und Kauf)</w:t>
+            </w:r>
+          </w:p>
+        </w:tc>
+      </w:tr>
+      <w:tr>
+        <w:tc>
+          <w:tcPr>
+            <w:tcW w:type="dxa" w:w="2041"/>
+          </w:tcPr>
+          <w:p>
+            <w:pPr>
+              <w:keepNext/>
+              <w:spacing w:after="20"/>
+            </w:pPr>
+            <w:r>
+              <w:rPr>
+                <w:sz w:val="19"/>
+              </w:rPr>
+            </w:r>
+            <w:r>
+              <w:rPr>
+                <w:b w:val="0"/>
+                <w:sz w:val="19"/>
+              </w:rPr>
+              <w:t>Cashflow</w:t>
+            </w:r>
+          </w:p>
+        </w:tc>
+        <w:tc>
+          <w:tcPr>
+            <w:tcW w:type="dxa" w:w="7370"/>
+          </w:tcPr>
+          <w:p>
+            <w:pPr>
+              <w:keepNext/>
+              <w:spacing w:after="20"/>
+            </w:pPr>
+            <w:r>
+              <w:rPr>
+                <w:sz w:val="19"/>
+              </w:rPr>
+            </w:r>
+            <w:r>
+              <w:rPr>
+                <w:b w:val="0"/>
+                <w:sz w:val="19"/>
+              </w:rPr>
+              <w:t>Kapitalflussrechnung je Jahr für das im Blatt Cashflow gewählte Szenario: operativ, Investition, Finanzierung, Liquidität, Kennzahlen, Diagramm</w:t>
             </w:r>
           </w:p>
         </w:tc>

</xml_diff>